<commit_message>
vault backup: 2026-07-07 18:28:39
</commit_message>
<xml_diff>
--- a/Учеба 4 семестр/Практика/Отчет о практике_2026_ЭковИА.docx
+++ b/Учеба 4 семестр/Практика/Отчет о практике_2026_ЭковИА.docx
@@ -2313,6 +2313,14 @@
           <w:bCs/>
           <w:u w:val="single" w:color="000000"/>
         </w:rPr>
+        <w:t xml:space="preserve"> зачтено</w:t>
+      </w:r>
+      <w:r>
+        <w:rPr>
+          <w:b/>
+          <w:bCs/>
+          <w:u w:val="single" w:color="000000"/>
+        </w:rPr>
         <w:tab/>
       </w:r>
     </w:p>
@@ -2435,6 +2443,73 @@
           <w:szCs w:val="2"/>
         </w:rPr>
       </w:pPr>
+      <w:r>
+        <w:rPr>
+          <w:noProof/>
+        </w:rPr>
+        <w:drawing>
+          <wp:anchor distT="0" distB="0" distL="114300" distR="114300" simplePos="0" relativeHeight="251670528" behindDoc="1" locked="0" layoutInCell="1" allowOverlap="1" wp14:anchorId="5858E85C" wp14:editId="253DBC44">
+            <wp:simplePos x="0" y="0"/>
+            <wp:positionH relativeFrom="column">
+              <wp:posOffset>3101340</wp:posOffset>
+            </wp:positionH>
+            <wp:positionV relativeFrom="paragraph">
+              <wp:posOffset>5080</wp:posOffset>
+            </wp:positionV>
+            <wp:extent cx="839470" cy="777240"/>
+            <wp:effectExtent l="0" t="0" r="0" b="3810"/>
+            <wp:wrapNone/>
+            <wp:docPr id="27" name="Рисунок 27"/>
+            <wp:cNvGraphicFramePr>
+              <a:graphicFrameLocks xmlns:a="http://schemas.openxmlformats.org/drawingml/2006/main" noChangeAspect="1"/>
+            </wp:cNvGraphicFramePr>
+            <a:graphic xmlns:a="http://schemas.openxmlformats.org/drawingml/2006/main">
+              <a:graphicData uri="http://schemas.openxmlformats.org/drawingml/2006/picture">
+                <pic:pic xmlns:pic="http://schemas.openxmlformats.org/drawingml/2006/picture">
+                  <pic:nvPicPr>
+                    <pic:cNvPr id="10" name="Рисунок 10"/>
+                    <pic:cNvPicPr>
+                      <a:picLocks noChangeAspect="1"/>
+                    </pic:cNvPicPr>
+                  </pic:nvPicPr>
+                  <pic:blipFill>
+                    <a:blip r:embed="rId10">
+                      <a:extLst>
+                        <a:ext uri="{28A0092B-C50C-407E-A947-70E740481C1C}">
+                          <a14:useLocalDpi xmlns:a14="http://schemas.microsoft.com/office/drawing/2010/main" val="0"/>
+                        </a:ext>
+                      </a:extLst>
+                    </a:blip>
+                    <a:srcRect/>
+                    <a:stretch>
+                      <a:fillRect/>
+                    </a:stretch>
+                  </pic:blipFill>
+                  <pic:spPr bwMode="auto">
+                    <a:xfrm>
+                      <a:off x="0" y="0"/>
+                      <a:ext cx="839470" cy="777240"/>
+                    </a:xfrm>
+                    <a:prstGeom prst="rect">
+                      <a:avLst/>
+                    </a:prstGeom>
+                    <a:noFill/>
+                    <a:ln>
+                      <a:noFill/>
+                    </a:ln>
+                  </pic:spPr>
+                </pic:pic>
+              </a:graphicData>
+            </a:graphic>
+            <wp14:sizeRelH relativeFrom="page">
+              <wp14:pctWidth>0</wp14:pctWidth>
+            </wp14:sizeRelH>
+            <wp14:sizeRelV relativeFrom="page">
+              <wp14:pctHeight>0</wp14:pctHeight>
+            </wp14:sizeRelV>
+          </wp:anchor>
+        </w:drawing>
+      </w:r>
       <w:r>
         <w:rPr>
           <w:noProof/>
@@ -2555,6 +2630,63 @@
         <w:ind w:left="382"/>
       </w:pPr>
       <w:r>
+        <w:rPr>
+          <w:b/>
+          <w:noProof/>
+          <w:sz w:val="28"/>
+          <w:szCs w:val="28"/>
+        </w:rPr>
+        <w:drawing>
+          <wp:anchor distT="0" distB="0" distL="114300" distR="114300" simplePos="0" relativeHeight="251671552" behindDoc="1" locked="0" layoutInCell="1" allowOverlap="1" wp14:anchorId="40304E3C" wp14:editId="5A82C0B5">
+            <wp:simplePos x="0" y="0"/>
+            <wp:positionH relativeFrom="page">
+              <wp:posOffset>3063296</wp:posOffset>
+            </wp:positionH>
+            <wp:positionV relativeFrom="paragraph">
+              <wp:posOffset>201930</wp:posOffset>
+            </wp:positionV>
+            <wp:extent cx="2202180" cy="1776775"/>
+            <wp:effectExtent l="0" t="0" r="0" b="0"/>
+            <wp:wrapNone/>
+            <wp:docPr id="44" name="Рисунок 44"/>
+            <wp:cNvGraphicFramePr>
+              <a:graphicFrameLocks xmlns:a="http://schemas.openxmlformats.org/drawingml/2006/main" noChangeAspect="1"/>
+            </wp:cNvGraphicFramePr>
+            <a:graphic xmlns:a="http://schemas.openxmlformats.org/drawingml/2006/main">
+              <a:graphicData uri="http://schemas.openxmlformats.org/drawingml/2006/picture">
+                <pic:pic xmlns:pic="http://schemas.openxmlformats.org/drawingml/2006/picture">
+                  <pic:nvPicPr>
+                    <pic:cNvPr id="44" name="Рисунок 44"/>
+                    <pic:cNvPicPr/>
+                  </pic:nvPicPr>
+                  <pic:blipFill>
+                    <a:blip r:embed="rId11"/>
+                    <a:stretch>
+                      <a:fillRect/>
+                    </a:stretch>
+                  </pic:blipFill>
+                  <pic:spPr>
+                    <a:xfrm>
+                      <a:off x="0" y="0"/>
+                      <a:ext cx="2202180" cy="1776775"/>
+                    </a:xfrm>
+                    <a:prstGeom prst="rect">
+                      <a:avLst/>
+                    </a:prstGeom>
+                  </pic:spPr>
+                </pic:pic>
+              </a:graphicData>
+            </a:graphic>
+            <wp14:sizeRelH relativeFrom="page">
+              <wp14:pctWidth>0</wp14:pctWidth>
+            </wp14:sizeRelH>
+            <wp14:sizeRelV relativeFrom="page">
+              <wp14:pctHeight>0</wp14:pctHeight>
+            </wp14:sizeRelV>
+          </wp:anchor>
+        </w:drawing>
+      </w:r>
+      <w:r>
         <w:t>Руководитель практической подготовки</w:t>
       </w:r>
     </w:p>
@@ -3045,7 +3177,7 @@
           <w:numId w:val="31"/>
         </w:numPr>
       </w:pPr>
-      <w:hyperlink r:id="rId10" w:anchor="_Toc506483745" w:history="1">
+      <w:hyperlink r:id="rId12" w:anchor="_Toc506483745" w:history="1">
         <w:r>
           <w:rPr>
             <w:rStyle w:val="af0"/>
@@ -3130,6 +3262,9 @@
           <w:ilvl w:val="1"/>
           <w:numId w:val="31"/>
         </w:numPr>
+        <w:rPr>
+          <w:webHidden/>
+        </w:rPr>
       </w:pPr>
       <w:r>
         <w:rPr>
@@ -3157,6 +3292,42 @@
           <w:webHidden/>
         </w:rPr>
         <w:t>8</w:t>
+      </w:r>
+    </w:p>
+    <w:p>
+      <w:pPr>
+        <w:pStyle w:val="1"/>
+        <w:numPr>
+          <w:ilvl w:val="1"/>
+          <w:numId w:val="31"/>
+        </w:numPr>
+      </w:pPr>
+      <w:r>
+        <w:rPr>
+          <w:rStyle w:val="af0"/>
+          <w:color w:val="auto"/>
+        </w:rPr>
+        <w:t>Исследование процесса обработки ссылки</w:t>
+      </w:r>
+      <w:r>
+        <w:rPr>
+          <w:rStyle w:val="af0"/>
+          <w:color w:val="auto"/>
+        </w:rPr>
+        <w:tab/>
+      </w:r>
+      <w:r>
+        <w:rPr>
+          <w:rStyle w:val="af0"/>
+          <w:color w:val="auto"/>
+        </w:rPr>
+        <w:tab/>
+      </w:r>
+      <w:r>
+        <w:rPr>
+          <w:webHidden/>
+        </w:rPr>
+        <w:t>13</w:t>
       </w:r>
     </w:p>
     <w:p>
@@ -3171,14 +3342,83 @@
           <w:color w:val="auto"/>
         </w:rPr>
       </w:pPr>
-      <w:hyperlink r:id="rId11" w:anchor="_Toc506483745" w:history="1">
-        <w:r>
-          <w:rPr>
-            <w:rStyle w:val="af0"/>
-            <w:color w:val="auto"/>
-          </w:rPr>
-          <w:t>Выводы</w:t>
-        </w:r>
+      <w:r>
+        <w:t>Выводы</w:t>
+      </w:r>
+      <w:r>
+        <w:tab/>
+      </w:r>
+      <w:r>
+        <w:tab/>
+      </w:r>
+      <w:r>
+        <w:rPr>
+          <w:webHidden/>
+        </w:rPr>
+        <w:t>14</w:t>
+      </w:r>
+    </w:p>
+    <w:p>
+      <w:pPr>
+        <w:pStyle w:val="1"/>
+        <w:numPr>
+          <w:ilvl w:val="0"/>
+          <w:numId w:val="31"/>
+        </w:numPr>
+        <w:rPr>
+          <w:rStyle w:val="af0"/>
+          <w:color w:val="auto"/>
+        </w:rPr>
+      </w:pPr>
+      <w:r>
+        <w:rPr>
+          <w:rStyle w:val="af0"/>
+          <w:color w:val="auto"/>
+        </w:rPr>
+        <w:t>Список использованных источников</w:t>
+      </w:r>
+      <w:r>
+        <w:rPr>
+          <w:rStyle w:val="af0"/>
+          <w:color w:val="auto"/>
+        </w:rPr>
+        <w:tab/>
+      </w:r>
+      <w:r>
+        <w:rPr>
+          <w:rStyle w:val="af0"/>
+          <w:color w:val="auto"/>
+        </w:rPr>
+        <w:tab/>
+      </w:r>
+      <w:r>
+        <w:rPr>
+          <w:webHidden/>
+        </w:rPr>
+        <w:t>15</w:t>
+      </w:r>
+    </w:p>
+    <w:p>
+      <w:pPr>
+        <w:pStyle w:val="1"/>
+        <w:numPr>
+          <w:ilvl w:val="0"/>
+          <w:numId w:val="0"/>
+        </w:numPr>
+        <w:ind w:left="360" w:hanging="360"/>
+        <w:rPr>
+          <w:rStyle w:val="af0"/>
+          <w:color w:val="auto"/>
+        </w:rPr>
+      </w:pPr>
+      <w:r>
+        <w:rPr>
+          <w:rStyle w:val="af0"/>
+          <w:color w:val="auto"/>
+        </w:rPr>
+        <w:t>Приложение А</w:t>
+      </w:r>
+      <w:hyperlink r:id="rId13" w:anchor="_Toc506483745" w:history="1">
         <w:r>
           <w:rPr>
             <w:rStyle w:val="af0"/>
@@ -3193,106 +3433,13 @@
           </w:rPr>
           <w:tab/>
         </w:r>
-        <w:r>
-          <w:rPr>
-            <w:rStyle w:val="af0"/>
-            <w:webHidden/>
-            <w:color w:val="auto"/>
-          </w:rPr>
-          <w:t>8</w:t>
-        </w:r>
       </w:hyperlink>
-    </w:p>
-    <w:p>
-      <w:pPr>
-        <w:pStyle w:val="1"/>
-        <w:numPr>
-          <w:ilvl w:val="0"/>
-          <w:numId w:val="31"/>
-        </w:numPr>
+      <w:r>
         <w:rPr>
           <w:rStyle w:val="af0"/>
           <w:color w:val="auto"/>
         </w:rPr>
-      </w:pPr>
-      <w:r>
-        <w:rPr>
-          <w:rStyle w:val="af0"/>
-          <w:color w:val="auto"/>
-        </w:rPr>
-        <w:t>Список использованных источников</w:t>
-      </w:r>
-      <w:r>
-        <w:rPr>
-          <w:rStyle w:val="af0"/>
-          <w:color w:val="auto"/>
-        </w:rPr>
-        <w:tab/>
-      </w:r>
-      <w:r>
-        <w:rPr>
-          <w:rStyle w:val="af0"/>
-          <w:color w:val="auto"/>
-        </w:rPr>
-        <w:tab/>
-      </w:r>
-      <w:hyperlink r:id="rId12" w:anchor="_Toc506483746" w:history="1">
-        <w:r>
-          <w:rPr>
-            <w:rStyle w:val="af0"/>
-            <w:webHidden/>
-            <w:color w:val="auto"/>
-          </w:rPr>
-          <w:t>9</w:t>
-        </w:r>
-      </w:hyperlink>
-    </w:p>
-    <w:p>
-      <w:pPr>
-        <w:pStyle w:val="1"/>
-        <w:numPr>
-          <w:ilvl w:val="0"/>
-          <w:numId w:val="0"/>
-        </w:numPr>
-        <w:ind w:left="360" w:hanging="360"/>
-        <w:rPr>
-          <w:rStyle w:val="af0"/>
-          <w:color w:val="auto"/>
-        </w:rPr>
-      </w:pPr>
-      <w:r>
-        <w:rPr>
-          <w:rStyle w:val="af0"/>
-          <w:color w:val="auto"/>
-          <w:highlight w:val="yellow"/>
-        </w:rPr>
-        <w:t>Приложение А</w:t>
-      </w:r>
-      <w:hyperlink r:id="rId13" w:anchor="_Toc506483745" w:history="1">
-        <w:r>
-          <w:rPr>
-            <w:rStyle w:val="af0"/>
-            <w:color w:val="auto"/>
-            <w:highlight w:val="yellow"/>
-          </w:rPr>
-          <w:tab/>
-        </w:r>
-        <w:r>
-          <w:rPr>
-            <w:rStyle w:val="af0"/>
-            <w:color w:val="auto"/>
-            <w:highlight w:val="yellow"/>
-          </w:rPr>
-          <w:tab/>
-        </w:r>
-      </w:hyperlink>
-      <w:r>
-        <w:rPr>
-          <w:rStyle w:val="af0"/>
-          <w:color w:val="auto"/>
-          <w:highlight w:val="yellow"/>
-        </w:rPr>
-        <w:t>10</w:t>
+        <w:t>16</w:t>
       </w:r>
     </w:p>
     <w:p>
@@ -5797,7 +5944,6 @@
           <w:bCs/>
           <w:sz w:val="28"/>
           <w:szCs w:val="28"/>
-          <w:lang w:val="en-US"/>
         </w:rPr>
       </w:pPr>
       <w:r>
@@ -6010,6 +6156,7 @@
         <w:rPr>
           <w:rFonts w:ascii="Times New Roman" w:hAnsi="Times New Roman" w:cs="Times New Roman"/>
           <w:bCs/>
+          <w:noProof/>
           <w:sz w:val="28"/>
           <w:szCs w:val="28"/>
           <w:lang w:val="en-US"/>
@@ -6061,7 +6208,6 @@
           <w:bCs/>
           <w:sz w:val="28"/>
           <w:szCs w:val="28"/>
-          <w:lang w:val="en-US"/>
         </w:rPr>
       </w:pPr>
       <w:r>
@@ -6081,8 +6227,29 @@
           <w:szCs w:val="28"/>
           <w:lang w:val="en-US"/>
         </w:rPr>
-        <w:t>Exploit.py</w:t>
-      </w:r>
+        <w:t>Exploit</w:t>
+      </w:r>
+      <w:r>
+        <w:rPr>
+          <w:rFonts w:ascii="Times New Roman" w:hAnsi="Times New Roman" w:cs="Times New Roman"/>
+          <w:bCs/>
+          <w:sz w:val="28"/>
+          <w:szCs w:val="28"/>
+        </w:rPr>
+        <w:t>.</w:t>
+      </w:r>
+      <w:proofErr w:type="spellStart"/>
+      <w:r>
+        <w:rPr>
+          <w:rFonts w:ascii="Times New Roman" w:hAnsi="Times New Roman" w:cs="Times New Roman"/>
+          <w:bCs/>
+          <w:sz w:val="28"/>
+          <w:szCs w:val="28"/>
+          <w:lang w:val="en-US"/>
+        </w:rPr>
+        <w:t>py</w:t>
+      </w:r>
+      <w:proofErr w:type="spellEnd"/>
     </w:p>
     <w:p>
       <w:pPr>
@@ -6272,6 +6439,7 @@
         <w:rPr>
           <w:rFonts w:ascii="Times New Roman" w:hAnsi="Times New Roman" w:cs="Times New Roman"/>
           <w:bCs/>
+          <w:noProof/>
           <w:sz w:val="28"/>
           <w:szCs w:val="28"/>
         </w:rPr>
@@ -6444,6 +6612,7 @@
         <w:rPr>
           <w:rFonts w:ascii="Times New Roman" w:hAnsi="Times New Roman" w:cs="Times New Roman"/>
           <w:bCs/>
+          <w:noProof/>
           <w:sz w:val="28"/>
           <w:szCs w:val="28"/>
           <w:lang w:val="en-US"/>
@@ -6726,6 +6895,7 @@
         <w:rPr>
           <w:rFonts w:ascii="Times New Roman" w:hAnsi="Times New Roman" w:cs="Times New Roman"/>
           <w:bCs/>
+          <w:noProof/>
           <w:sz w:val="28"/>
           <w:szCs w:val="28"/>
           <w:lang w:val="en-US"/>
@@ -6833,6 +7003,7 @@
         <w:rPr>
           <w:rFonts w:ascii="Times New Roman" w:hAnsi="Times New Roman" w:cs="Times New Roman"/>
           <w:bCs/>
+          <w:noProof/>
           <w:sz w:val="28"/>
           <w:szCs w:val="28"/>
         </w:rPr>
@@ -6972,6 +7143,7 @@
         <w:rPr>
           <w:rFonts w:ascii="Times New Roman" w:hAnsi="Times New Roman" w:cs="Times New Roman"/>
           <w:bCs/>
+          <w:noProof/>
           <w:sz w:val="28"/>
           <w:szCs w:val="28"/>
           <w:lang w:val="en-US"/>
@@ -7051,6 +7223,7 @@
         <w:rPr>
           <w:rFonts w:ascii="Times New Roman" w:hAnsi="Times New Roman" w:cs="Times New Roman"/>
           <w:bCs/>
+          <w:noProof/>
           <w:sz w:val="28"/>
           <w:szCs w:val="28"/>
         </w:rPr>
@@ -7211,6 +7384,7 @@
         <w:rPr>
           <w:rFonts w:ascii="Times New Roman" w:hAnsi="Times New Roman" w:cs="Times New Roman"/>
           <w:bCs/>
+          <w:noProof/>
           <w:sz w:val="28"/>
           <w:szCs w:val="28"/>
         </w:rPr>
@@ -7290,6 +7464,7 @@
         <w:rPr>
           <w:rFonts w:ascii="Times New Roman" w:hAnsi="Times New Roman" w:cs="Times New Roman"/>
           <w:bCs/>
+          <w:noProof/>
           <w:sz w:val="28"/>
           <w:szCs w:val="28"/>
           <w:lang w:val="en-US"/>
@@ -7459,34 +7634,7 @@
           <w:szCs w:val="28"/>
         </w:rPr>
         <w:lastRenderedPageBreak/>
-        <w:t>2.</w:t>
-      </w:r>
-      <w:r>
-        <w:rPr>
-          <w:rFonts w:ascii="Times New Roman" w:hAnsi="Times New Roman" w:cs="Times New Roman"/>
-          <w:b/>
-          <w:sz w:val="32"/>
-          <w:szCs w:val="28"/>
-        </w:rPr>
-        <w:t>4</w:t>
-      </w:r>
-      <w:r>
-        <w:rPr>
-          <w:rFonts w:ascii="Times New Roman" w:hAnsi="Times New Roman" w:cs="Times New Roman"/>
-          <w:b/>
-          <w:sz w:val="32"/>
-          <w:szCs w:val="28"/>
-        </w:rPr>
-        <w:t xml:space="preserve">. </w:t>
-      </w:r>
-      <w:r>
-        <w:rPr>
-          <w:rFonts w:ascii="Times New Roman" w:hAnsi="Times New Roman" w:cs="Times New Roman"/>
-          <w:b/>
-          <w:sz w:val="32"/>
-          <w:szCs w:val="28"/>
-        </w:rPr>
-        <w:t>Исследование процесса обработки ссылки</w:t>
+        <w:t>2.4. Исследование процесса обработки ссылки</w:t>
       </w:r>
     </w:p>
     <w:p>
@@ -7867,7 +8015,6 @@
           <w:rFonts w:ascii="Times New Roman" w:hAnsi="Times New Roman" w:cs="Times New Roman"/>
           <w:sz w:val="28"/>
           <w:szCs w:val="28"/>
-          <w:lang w:val="en-US"/>
         </w:rPr>
       </w:pPr>
       <w:r>
@@ -7925,7 +8072,6 @@
           <w:rFonts w:ascii="Times New Roman" w:hAnsi="Times New Roman" w:cs="Times New Roman"/>
           <w:sz w:val="28"/>
           <w:szCs w:val="28"/>
-          <w:lang w:val="en-US"/>
         </w:rPr>
       </w:pPr>
     </w:p>
@@ -7938,7 +8084,6 @@
           <w:rFonts w:ascii="Times New Roman" w:hAnsi="Times New Roman" w:cs="Times New Roman"/>
           <w:sz w:val="28"/>
           <w:szCs w:val="28"/>
-          <w:lang w:val="en-US"/>
         </w:rPr>
       </w:pPr>
     </w:p>
@@ -7951,7 +8096,6 @@
           <w:rFonts w:ascii="Times New Roman" w:hAnsi="Times New Roman" w:cs="Times New Roman"/>
           <w:sz w:val="28"/>
           <w:szCs w:val="28"/>
-          <w:lang w:val="en-US"/>
         </w:rPr>
       </w:pPr>
     </w:p>
@@ -7964,7 +8108,6 @@
           <w:rFonts w:ascii="Times New Roman" w:hAnsi="Times New Roman" w:cs="Times New Roman"/>
           <w:sz w:val="28"/>
           <w:szCs w:val="28"/>
-          <w:lang w:val="en-US"/>
         </w:rPr>
       </w:pPr>
     </w:p>
@@ -7977,7 +8120,6 @@
           <w:rFonts w:ascii="Times New Roman" w:hAnsi="Times New Roman" w:cs="Times New Roman"/>
           <w:sz w:val="28"/>
           <w:szCs w:val="28"/>
-          <w:lang w:val="en-US"/>
         </w:rPr>
       </w:pPr>
     </w:p>
@@ -7990,7 +8132,6 @@
           <w:rFonts w:ascii="Times New Roman" w:hAnsi="Times New Roman" w:cs="Times New Roman"/>
           <w:sz w:val="28"/>
           <w:szCs w:val="28"/>
-          <w:lang w:val="en-US"/>
         </w:rPr>
       </w:pPr>
     </w:p>
@@ -8003,7 +8144,6 @@
           <w:rFonts w:ascii="Times New Roman" w:hAnsi="Times New Roman" w:cs="Times New Roman"/>
           <w:sz w:val="28"/>
           <w:szCs w:val="28"/>
-          <w:lang w:val="en-US"/>
         </w:rPr>
       </w:pPr>
     </w:p>
@@ -8016,7 +8156,6 @@
           <w:rFonts w:ascii="Times New Roman" w:hAnsi="Times New Roman" w:cs="Times New Roman"/>
           <w:sz w:val="28"/>
           <w:szCs w:val="28"/>
-          <w:lang w:val="en-US"/>
         </w:rPr>
       </w:pPr>
     </w:p>
@@ -8029,7 +8168,6 @@
           <w:rFonts w:ascii="Times New Roman" w:hAnsi="Times New Roman" w:cs="Times New Roman"/>
           <w:sz w:val="28"/>
           <w:szCs w:val="28"/>
-          <w:lang w:val="en-US"/>
         </w:rPr>
       </w:pPr>
     </w:p>
@@ -8042,7 +8180,6 @@
           <w:rFonts w:ascii="Times New Roman" w:hAnsi="Times New Roman" w:cs="Times New Roman"/>
           <w:sz w:val="28"/>
           <w:szCs w:val="28"/>
-          <w:lang w:val="en-US"/>
         </w:rPr>
       </w:pPr>
     </w:p>
@@ -8055,7 +8192,6 @@
           <w:rFonts w:ascii="Times New Roman" w:hAnsi="Times New Roman" w:cs="Times New Roman"/>
           <w:sz w:val="28"/>
           <w:szCs w:val="28"/>
-          <w:lang w:val="en-US"/>
         </w:rPr>
       </w:pPr>
     </w:p>
@@ -8068,7 +8204,6 @@
           <w:rFonts w:ascii="Times New Roman" w:hAnsi="Times New Roman" w:cs="Times New Roman"/>
           <w:sz w:val="28"/>
           <w:szCs w:val="28"/>
-          <w:lang w:val="en-US"/>
         </w:rPr>
       </w:pPr>
     </w:p>
@@ -8081,7 +8216,6 @@
           <w:rFonts w:ascii="Times New Roman" w:hAnsi="Times New Roman" w:cs="Times New Roman"/>
           <w:sz w:val="28"/>
           <w:szCs w:val="28"/>
-          <w:lang w:val="en-US"/>
         </w:rPr>
       </w:pPr>
     </w:p>
@@ -8094,7 +8228,6 @@
           <w:rFonts w:ascii="Times New Roman" w:hAnsi="Times New Roman" w:cs="Times New Roman"/>
           <w:sz w:val="28"/>
           <w:szCs w:val="28"/>
-          <w:lang w:val="en-US"/>
         </w:rPr>
       </w:pPr>
     </w:p>
@@ -8107,7 +8240,6 @@
           <w:rFonts w:ascii="Times New Roman" w:hAnsi="Times New Roman" w:cs="Times New Roman"/>
           <w:sz w:val="28"/>
           <w:szCs w:val="28"/>
-          <w:lang w:val="en-US"/>
         </w:rPr>
       </w:pPr>
     </w:p>
@@ -8120,7 +8252,6 @@
           <w:rFonts w:ascii="Times New Roman" w:hAnsi="Times New Roman" w:cs="Times New Roman"/>
           <w:sz w:val="28"/>
           <w:szCs w:val="28"/>
-          <w:lang w:val="en-US"/>
         </w:rPr>
       </w:pPr>
     </w:p>
@@ -8133,7 +8264,6 @@
           <w:rFonts w:ascii="Times New Roman" w:hAnsi="Times New Roman" w:cs="Times New Roman"/>
           <w:sz w:val="28"/>
           <w:szCs w:val="28"/>
-          <w:lang w:val="en-US"/>
         </w:rPr>
       </w:pPr>
     </w:p>
@@ -8146,7 +8276,6 @@
           <w:rFonts w:ascii="Times New Roman" w:hAnsi="Times New Roman" w:cs="Times New Roman"/>
           <w:sz w:val="28"/>
           <w:szCs w:val="28"/>
-          <w:lang w:val="en-US"/>
         </w:rPr>
       </w:pPr>
     </w:p>
@@ -8159,7 +8288,6 @@
           <w:rFonts w:ascii="Times New Roman" w:hAnsi="Times New Roman" w:cs="Times New Roman"/>
           <w:sz w:val="28"/>
           <w:szCs w:val="28"/>
-          <w:lang w:val="en-US"/>
         </w:rPr>
       </w:pPr>
     </w:p>
@@ -8172,7 +8300,6 @@
           <w:rFonts w:ascii="Times New Roman" w:hAnsi="Times New Roman" w:cs="Times New Roman"/>
           <w:sz w:val="28"/>
           <w:szCs w:val="28"/>
-          <w:lang w:val="en-US"/>
         </w:rPr>
       </w:pPr>
     </w:p>
@@ -8185,7 +8312,6 @@
           <w:rFonts w:ascii="Times New Roman" w:hAnsi="Times New Roman" w:cs="Times New Roman"/>
           <w:sz w:val="28"/>
           <w:szCs w:val="28"/>
-          <w:lang w:val="en-US"/>
         </w:rPr>
       </w:pPr>
     </w:p>
@@ -8354,14 +8480,7 @@
           <w:sz w:val="28"/>
           <w:szCs w:val="28"/>
         </w:rPr>
-        <w:t xml:space="preserve"> </w:t>
-      </w:r>
-      <w:r>
-        <w:rPr>
-          <w:sz w:val="28"/>
-          <w:szCs w:val="28"/>
-        </w:rPr>
-        <w:t>[Электронный ресурс]</w:t>
+        <w:t xml:space="preserve"> [Электронный ресурс]</w:t>
       </w:r>
       <w:r>
         <w:t xml:space="preserve"> </w:t>
@@ -8623,21 +8742,7 @@
           <w:sz w:val="28"/>
           <w:szCs w:val="28"/>
         </w:rPr>
-        <w:t xml:space="preserve">] </w:t>
-      </w:r>
-      <w:r>
-        <w:rPr>
-          <w:sz w:val="28"/>
-          <w:szCs w:val="28"/>
-        </w:rPr>
-        <w:t>–</w:t>
-      </w:r>
-      <w:r>
-        <w:rPr>
-          <w:sz w:val="28"/>
-          <w:szCs w:val="28"/>
-        </w:rPr>
-        <w:t xml:space="preserve"> </w:t>
+        <w:t xml:space="preserve">] – </w:t>
       </w:r>
       <w:hyperlink r:id="rId35" w:history="1">
         <w:r>
@@ -9060,7 +9165,6 @@
         <w:rPr>
           <w:sz w:val="28"/>
           <w:szCs w:val="28"/>
-          <w:lang w:val="en-US"/>
         </w:rPr>
       </w:pPr>
     </w:p>
@@ -9091,7 +9195,16 @@
           <w:szCs w:val="28"/>
         </w:rPr>
         <w:lastRenderedPageBreak/>
-        <w:t>Приложения</w:t>
+        <w:t>Приложени</w:t>
+      </w:r>
+      <w:r>
+        <w:rPr>
+          <w:rFonts w:ascii="Times New Roman" w:hAnsi="Times New Roman" w:cs="Times New Roman"/>
+          <w:b/>
+          <w:sz w:val="32"/>
+          <w:szCs w:val="28"/>
+        </w:rPr>
+        <w:t>е А</w:t>
       </w:r>
     </w:p>
     <w:p>
@@ -16622,6 +16735,7 @@
   <w:style w:type="character" w:default="1" w:styleId="a0">
     <w:name w:val="Default Paragraph Font"/>
     <w:uiPriority w:val="1"/>
+    <w:semiHidden/>
     <w:unhideWhenUsed/>
   </w:style>
   <w:style w:type="table" w:default="1" w:styleId="a1">

</xml_diff>

<commit_message>
UPDATE: отчет DATE: 2026-07-07 18:41:24
</commit_message>
<xml_diff>
--- a/Учеба 4 семестр/Практика/Отчет о практике_2026_ЭковИА.docx
+++ b/Учеба 4 семестр/Практика/Отчет о практике_2026_ЭковИА.docx
@@ -3676,11 +3676,8 @@
     <w:p>
       <w:pPr>
         <w:pStyle w:val="af"/>
-        <w:numPr>
-          <w:ilvl w:val="0"/>
-          <w:numId w:val="35"/>
-        </w:numPr>
-        <w:spacing w:line="360" w:lineRule="auto"/>
+        <w:spacing w:line="360" w:lineRule="auto"/>
+        <w:ind w:left="720"/>
         <w:jc w:val="both"/>
         <w:rPr>
           <w:rFonts w:ascii="Times New Roman" w:hAnsi="Times New Roman" w:cs="Times New Roman"/>
@@ -3688,26 +3685,30 @@
           <w:szCs w:val="28"/>
         </w:rPr>
       </w:pPr>
-      <w:r>
-        <w:rPr>
-          <w:rFonts w:ascii="Times New Roman" w:hAnsi="Times New Roman" w:cs="Times New Roman"/>
-          <w:sz w:val="28"/>
-          <w:szCs w:val="28"/>
-        </w:rPr>
-        <w:t>Изучить изменения, внесенные разработчиком для устранения уязвимости, и оценить их влияние на безопасность.</w:t>
-      </w:r>
     </w:p>
     <w:p>
       <w:pPr>
         <w:pStyle w:val="af"/>
         <w:spacing w:line="360" w:lineRule="auto"/>
-        <w:ind w:left="360"/>
+        <w:ind w:left="720"/>
         <w:jc w:val="both"/>
         <w:rPr>
           <w:rFonts w:ascii="Times New Roman" w:hAnsi="Times New Roman" w:cs="Times New Roman"/>
           <w:sz w:val="28"/>
           <w:szCs w:val="28"/>
-          <w:highlight w:val="yellow"/>
+        </w:rPr>
+      </w:pPr>
+    </w:p>
+    <w:p>
+      <w:pPr>
+        <w:pStyle w:val="af"/>
+        <w:spacing w:line="360" w:lineRule="auto"/>
+        <w:ind w:left="720"/>
+        <w:jc w:val="both"/>
+        <w:rPr>
+          <w:rFonts w:ascii="Times New Roman" w:hAnsi="Times New Roman" w:cs="Times New Roman"/>
+          <w:sz w:val="28"/>
+          <w:szCs w:val="28"/>
         </w:rPr>
       </w:pPr>
     </w:p>
@@ -3970,6 +3971,7 @@
       <w:pPr>
         <w:pStyle w:val="af"/>
         <w:spacing w:line="360" w:lineRule="auto"/>
+        <w:ind w:firstLine="851"/>
         <w:jc w:val="both"/>
         <w:rPr>
           <w:rFonts w:ascii="Times New Roman" w:hAnsi="Times New Roman" w:cs="Times New Roman"/>
@@ -3999,7 +4001,23 @@
           <w:sz w:val="28"/>
           <w:szCs w:val="28"/>
         </w:rPr>
-        <w:t xml:space="preserve">— это критическая уязвимость (с оценкой 9.8 по шкале CVSS) удаленного выполнения кода (RCE) и кражи учетных данных, обнаруженная в почтовом клиенте Microsoft Outlook. </w:t>
+        <w:t>— это критическая уязвимость (с оценкой 9.8 по шкале CVSS) удаленного выполнения кода (RCE) и кражи учетных данных, обнаруженная в почтовом клиенте Microsoft Outlook</w:t>
+      </w:r>
+      <w:r>
+        <w:rPr>
+          <w:rFonts w:ascii="Times New Roman" w:hAnsi="Times New Roman" w:cs="Times New Roman"/>
+          <w:sz w:val="28"/>
+          <w:szCs w:val="28"/>
+        </w:rPr>
+        <w:t xml:space="preserve"> [3]</w:t>
+      </w:r>
+      <w:r>
+        <w:rPr>
+          <w:rFonts w:ascii="Times New Roman" w:hAnsi="Times New Roman" w:cs="Times New Roman"/>
+          <w:sz w:val="28"/>
+          <w:szCs w:val="28"/>
+        </w:rPr>
+        <w:t xml:space="preserve">. </w:t>
       </w:r>
       <w:r>
         <w:rPr>
@@ -4095,7 +4113,23 @@
           <w:sz w:val="28"/>
           <w:szCs w:val="28"/>
         </w:rPr>
-        <w:t>).</w:t>
+        <w:t>)</w:t>
+      </w:r>
+      <w:r>
+        <w:rPr>
+          <w:rFonts w:ascii="Times New Roman" w:hAnsi="Times New Roman" w:cs="Times New Roman"/>
+          <w:sz w:val="28"/>
+          <w:szCs w:val="28"/>
+        </w:rPr>
+        <w:t xml:space="preserve"> [1]</w:t>
+      </w:r>
+      <w:r>
+        <w:rPr>
+          <w:rFonts w:ascii="Times New Roman" w:hAnsi="Times New Roman" w:cs="Times New Roman"/>
+          <w:sz w:val="28"/>
+          <w:szCs w:val="28"/>
+        </w:rPr>
+        <w:t>.</w:t>
       </w:r>
       <w:r>
         <w:rPr>
@@ -4253,6 +4287,7 @@
       <w:pPr>
         <w:pStyle w:val="af"/>
         <w:spacing w:line="360" w:lineRule="auto"/>
+        <w:ind w:firstLine="851"/>
         <w:jc w:val="both"/>
         <w:rPr>
           <w:rFonts w:ascii="Times New Roman" w:hAnsi="Times New Roman" w:cs="Times New Roman"/>
@@ -4329,7 +4364,16 @@
           <w:sz w:val="28"/>
           <w:szCs w:val="28"/>
         </w:rPr>
-        <w:t>(пути к файлу или системой команды) в готовый к работе указатель на объект.</w:t>
+        <w:t xml:space="preserve">(пути к файлу или системой команды) в готовый к работе </w:t>
+      </w:r>
+      <w:r>
+        <w:rPr>
+          <w:rFonts w:ascii="Times New Roman" w:hAnsi="Times New Roman" w:cs="Times New Roman"/>
+          <w:sz w:val="28"/>
+          <w:szCs w:val="28"/>
+        </w:rPr>
+        <w:lastRenderedPageBreak/>
+        <w:t>указатель на объект.</w:t>
       </w:r>
       <w:r>
         <w:rPr>
@@ -4345,7 +4389,6 @@
           <w:sz w:val="28"/>
           <w:szCs w:val="28"/>
         </w:rPr>
-        <w:lastRenderedPageBreak/>
         <w:t>Работа с Moniker-объектом осуществляется при помощи интерфейса IMoniker. Всего в IMoniker (включая унаследованные методы) входит более 20 методов.</w:t>
       </w:r>
       <w:r>
@@ -4628,6 +4671,7 @@
       <w:pPr>
         <w:pStyle w:val="af"/>
         <w:spacing w:line="360" w:lineRule="auto"/>
+        <w:ind w:firstLine="851"/>
         <w:jc w:val="both"/>
         <w:rPr>
           <w:rFonts w:ascii="Times New Roman" w:hAnsi="Times New Roman" w:cs="Times New Roman"/>
@@ -4650,7 +4694,23 @@
           <w:szCs w:val="28"/>
         </w:rPr>
         <w:lastRenderedPageBreak/>
-        <w:t xml:space="preserve">передавало ее стандартному механизму обработки гиперссылок Windows. В процессе обработки библиотека hlink.dll вызывала функцию </w:t>
+        <w:t>передавало ее стандартному механизму обработки гиперссылок Windows</w:t>
+      </w:r>
+      <w:r>
+        <w:rPr>
+          <w:rFonts w:ascii="Times New Roman" w:hAnsi="Times New Roman" w:cs="Times New Roman"/>
+          <w:sz w:val="28"/>
+          <w:szCs w:val="28"/>
+        </w:rPr>
+        <w:t xml:space="preserve"> [2]</w:t>
+      </w:r>
+      <w:r>
+        <w:rPr>
+          <w:rFonts w:ascii="Times New Roman" w:hAnsi="Times New Roman" w:cs="Times New Roman"/>
+          <w:sz w:val="28"/>
+          <w:szCs w:val="28"/>
+        </w:rPr>
+        <w:t xml:space="preserve">. В процессе обработки библиотека hlink.dll вызывала функцию </w:t>
       </w:r>
       <w:proofErr w:type="spellStart"/>
       <w:r>
@@ -4668,7 +4728,31 @@
           <w:sz w:val="28"/>
           <w:szCs w:val="28"/>
         </w:rPr>
-        <w:t xml:space="preserve">, которая интерпретировала строку как COM Moniker. В результате строка, воспринимаемая Outlook как обычная гиперссылка, обрабатывалась системой как инструкция по созданию составного Moniker. </w:t>
+        <w:t>, которая интерпретировала строку как COM Moniker</w:t>
+      </w:r>
+      <w:r>
+        <w:rPr>
+          <w:rFonts w:ascii="Times New Roman" w:hAnsi="Times New Roman" w:cs="Times New Roman"/>
+          <w:sz w:val="28"/>
+          <w:szCs w:val="28"/>
+        </w:rPr>
+        <w:t xml:space="preserve"> [1</w:t>
+      </w:r>
+      <w:r>
+        <w:rPr>
+          <w:rFonts w:ascii="Times New Roman" w:hAnsi="Times New Roman" w:cs="Times New Roman"/>
+          <w:sz w:val="28"/>
+          <w:szCs w:val="28"/>
+        </w:rPr>
+        <w:t>]</w:t>
+      </w:r>
+      <w:r>
+        <w:rPr>
+          <w:rFonts w:ascii="Times New Roman" w:hAnsi="Times New Roman" w:cs="Times New Roman"/>
+          <w:sz w:val="28"/>
+          <w:szCs w:val="28"/>
+        </w:rPr>
+        <w:t xml:space="preserve">. В результате строка, воспринимаемая Outlook как обычная гиперссылка, обрабатывалась системой как инструкция по созданию составного Moniker. </w:t>
       </w:r>
       <w:r>
         <w:rPr>
@@ -4965,7 +5049,7 @@
       <w:pPr>
         <w:pStyle w:val="af"/>
         <w:spacing w:line="360" w:lineRule="auto"/>
-        <w:ind w:firstLine="709"/>
+        <w:ind w:firstLine="851"/>
         <w:jc w:val="both"/>
         <w:rPr>
           <w:rFonts w:ascii="Times New Roman" w:hAnsi="Times New Roman" w:cs="Times New Roman"/>
@@ -4988,7 +5072,7 @@
       <w:pPr>
         <w:pStyle w:val="af"/>
         <w:spacing w:line="360" w:lineRule="auto"/>
-        <w:ind w:firstLine="709"/>
+        <w:ind w:firstLine="851"/>
         <w:jc w:val="both"/>
         <w:rPr>
           <w:rFonts w:ascii="Times New Roman" w:hAnsi="Times New Roman" w:cs="Times New Roman"/>
@@ -5015,6 +5099,7 @@
           <w:numId w:val="37"/>
         </w:numPr>
         <w:spacing w:line="360" w:lineRule="auto"/>
+        <w:ind w:firstLine="851"/>
         <w:jc w:val="both"/>
         <w:rPr>
           <w:rFonts w:ascii="Times New Roman" w:hAnsi="Times New Roman" w:cs="Times New Roman"/>
@@ -5050,6 +5135,7 @@
           <w:numId w:val="37"/>
         </w:numPr>
         <w:spacing w:line="360" w:lineRule="auto"/>
+        <w:ind w:firstLine="851"/>
         <w:jc w:val="both"/>
         <w:rPr>
           <w:rFonts w:ascii="Times New Roman" w:hAnsi="Times New Roman" w:cs="Times New Roman"/>
@@ -5076,6 +5162,7 @@
           <w:numId w:val="37"/>
         </w:numPr>
         <w:spacing w:line="360" w:lineRule="auto"/>
+        <w:ind w:firstLine="851"/>
         <w:jc w:val="both"/>
         <w:rPr>
           <w:rFonts w:ascii="Times New Roman" w:hAnsi="Times New Roman" w:cs="Times New Roman"/>
@@ -5402,7 +5489,7 @@
       <w:pPr>
         <w:pStyle w:val="af"/>
         <w:spacing w:line="360" w:lineRule="auto"/>
-        <w:ind w:firstLine="709"/>
+        <w:ind w:firstLine="851"/>
         <w:jc w:val="both"/>
         <w:rPr>
           <w:rFonts w:ascii="Times New Roman" w:hAnsi="Times New Roman" w:cs="Times New Roman"/>
@@ -5576,7 +5663,7 @@
       <w:pPr>
         <w:pStyle w:val="af"/>
         <w:spacing w:line="360" w:lineRule="auto"/>
-        <w:ind w:left="709"/>
+        <w:ind w:firstLine="851"/>
         <w:jc w:val="both"/>
         <w:rPr>
           <w:rFonts w:ascii="Times New Roman" w:hAnsi="Times New Roman" w:cs="Times New Roman"/>
@@ -5729,6 +5816,7 @@
       <w:pPr>
         <w:pStyle w:val="af"/>
         <w:spacing w:line="360" w:lineRule="auto"/>
+        <w:ind w:firstLine="851"/>
         <w:jc w:val="both"/>
         <w:rPr>
           <w:rFonts w:ascii="Times New Roman" w:hAnsi="Times New Roman" w:cs="Times New Roman"/>
@@ -5850,6 +5938,7 @@
       <w:pPr>
         <w:pStyle w:val="af"/>
         <w:spacing w:line="360" w:lineRule="auto"/>
+        <w:ind w:firstLine="851"/>
         <w:jc w:val="both"/>
         <w:rPr>
           <w:rFonts w:ascii="Times New Roman" w:hAnsi="Times New Roman" w:cs="Times New Roman"/>
@@ -5938,6 +6027,7 @@
       <w:pPr>
         <w:pStyle w:val="af"/>
         <w:spacing w:line="360" w:lineRule="auto"/>
+        <w:ind w:firstLine="851"/>
         <w:jc w:val="both"/>
         <w:rPr>
           <w:rFonts w:ascii="Times New Roman" w:hAnsi="Times New Roman" w:cs="Times New Roman"/>
@@ -6117,6 +6207,7 @@
           </w:rPr>
           <w:t>.</w:t>
         </w:r>
+        <w:proofErr w:type="spellStart"/>
         <w:r>
           <w:rPr>
             <w:rStyle w:val="af0"/>
@@ -6128,6 +6219,7 @@
           </w:rPr>
           <w:t>thm</w:t>
         </w:r>
+        <w:proofErr w:type="spellEnd"/>
       </w:hyperlink>
       <w:r>
         <w:rPr>
@@ -6385,6 +6477,7 @@
       <w:pPr>
         <w:pStyle w:val="af"/>
         <w:spacing w:line="360" w:lineRule="auto"/>
+        <w:ind w:firstLine="851"/>
         <w:jc w:val="both"/>
         <w:rPr>
           <w:rFonts w:ascii="Times New Roman" w:hAnsi="Times New Roman" w:cs="Times New Roman"/>
@@ -6521,6 +6614,7 @@
       <w:pPr>
         <w:pStyle w:val="af"/>
         <w:spacing w:line="360" w:lineRule="auto"/>
+        <w:ind w:firstLine="851"/>
         <w:jc w:val="both"/>
         <w:rPr>
           <w:rFonts w:ascii="Times New Roman" w:hAnsi="Times New Roman" w:cs="Times New Roman"/>
@@ -6727,6 +6821,7 @@
       <w:pPr>
         <w:pStyle w:val="af"/>
         <w:spacing w:line="360" w:lineRule="auto"/>
+        <w:ind w:firstLine="851"/>
         <w:jc w:val="both"/>
         <w:rPr>
           <w:rFonts w:ascii="Times New Roman" w:hAnsi="Times New Roman" w:cs="Times New Roman"/>
@@ -7108,6 +7203,7 @@
       <w:pPr>
         <w:pStyle w:val="af"/>
         <w:spacing w:line="360" w:lineRule="auto"/>
+        <w:ind w:firstLine="851"/>
         <w:jc w:val="both"/>
         <w:rPr>
           <w:rFonts w:ascii="Times New Roman" w:hAnsi="Times New Roman" w:cs="Times New Roman"/>
@@ -7290,6 +7386,7 @@
       <w:pPr>
         <w:pStyle w:val="af"/>
         <w:spacing w:line="360" w:lineRule="auto"/>
+        <w:ind w:firstLine="851"/>
         <w:jc w:val="both"/>
         <w:rPr>
           <w:rFonts w:ascii="Times New Roman" w:hAnsi="Times New Roman" w:cs="Times New Roman"/>
@@ -7542,6 +7639,7 @@
       <w:pPr>
         <w:pStyle w:val="af"/>
         <w:spacing w:line="360" w:lineRule="auto"/>
+        <w:ind w:firstLine="851"/>
         <w:jc w:val="both"/>
         <w:rPr>
           <w:rFonts w:ascii="Times New Roman" w:hAnsi="Times New Roman" w:cs="Times New Roman"/>
@@ -7641,6 +7739,7 @@
       <w:pPr>
         <w:pStyle w:val="af"/>
         <w:spacing w:line="360" w:lineRule="auto"/>
+        <w:ind w:firstLine="851"/>
         <w:jc w:val="both"/>
         <w:rPr>
           <w:rFonts w:ascii="Times New Roman" w:hAnsi="Times New Roman" w:cs="Times New Roman"/>
@@ -7777,6 +7876,7 @@
       <w:pPr>
         <w:pStyle w:val="af"/>
         <w:spacing w:line="360" w:lineRule="auto"/>
+        <w:ind w:firstLine="851"/>
         <w:jc w:val="both"/>
         <w:rPr>
           <w:rFonts w:ascii="Times New Roman" w:hAnsi="Times New Roman" w:cs="Times New Roman"/>
@@ -8010,6 +8110,7 @@
       <w:pPr>
         <w:pStyle w:val="af"/>
         <w:spacing w:line="360" w:lineRule="auto"/>
+        <w:ind w:firstLine="851"/>
         <w:jc w:val="both"/>
         <w:rPr>
           <w:rFonts w:ascii="Times New Roman" w:hAnsi="Times New Roman" w:cs="Times New Roman"/>
@@ -12481,6 +12582,7 @@
         <w:rPr>
           <w:sz w:val="28"/>
           <w:szCs w:val="28"/>
+          <w:lang w:val="en-US"/>
         </w:rPr>
       </w:pPr>
     </w:p>

</xml_diff>

<commit_message>
UPDATE: pdf DATE: 2026-07-07 18:47:55
</commit_message>
<xml_diff>
--- a/Учеба 4 семестр/Практика/Отчет о практике_2026_ЭковИА.docx
+++ b/Учеба 4 семестр/Практика/Отчет о практике_2026_ЭковИА.docx
@@ -463,7 +463,7 @@
               </wp:anchor>
             </w:drawing>
           </mc:Choice>
-          <mc:Fallback xmlns:w16sdtfl="http://schemas.microsoft.com/office/word/2024/wordml/sdtformatlock" xmlns:w16du="http://schemas.microsoft.com/office/word/2023/wordml/word16du">
+          <mc:Fallback xmlns:w16du="http://schemas.microsoft.com/office/word/2023/wordml/word16du" xmlns:w16sdtfl="http://schemas.microsoft.com/office/word/2024/wordml/sdtformatlock">
             <w:pict>
               <v:shape w14:anchorId="302EEC3A" id="Freeform 36" o:spid="_x0000_s1026" style="position:absolute;margin-left:78.95pt;margin-top:12pt;width:468.05pt;height:0;z-index:251654144;visibility:visible;mso-wrap-style:square;mso-width-percent:0;mso-height-percent:0;mso-wrap-distance-left:0;mso-wrap-distance-top:0;mso-wrap-distance-right:0;mso-wrap-distance-bottom:0;mso-position-horizontal:absolute;mso-position-horizontal-relative:page;mso-position-vertical:absolute;mso-position-vertical-relative:text;mso-width-percent:0;mso-height-percent:0;mso-width-relative:page;mso-height-relative:page;v-text-anchor:top" coordsize="9362,20" o:gfxdata="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" o:allowincell="f" path="m,l9362,e" filled="f" strokeweight=".16931mm">
                 <v:path arrowok="t" o:connecttype="custom" o:connectlocs="0,0;5944235,0" o:connectangles="0,0"/>
@@ -629,7 +629,7 @@
               </wp:anchor>
             </w:drawing>
           </mc:Choice>
-          <mc:Fallback xmlns:w16sdtfl="http://schemas.microsoft.com/office/word/2024/wordml/sdtformatlock" xmlns:w16du="http://schemas.microsoft.com/office/word/2023/wordml/word16du">
+          <mc:Fallback xmlns:w16du="http://schemas.microsoft.com/office/word/2023/wordml/word16du" xmlns:w16sdtfl="http://schemas.microsoft.com/office/word/2024/wordml/sdtformatlock">
             <w:pict>
               <v:shape w14:anchorId="6C74420D" id="Freeform 37" o:spid="_x0000_s1026" style="position:absolute;margin-left:78.95pt;margin-top:12.1pt;width:468.05pt;height:0;z-index:251655168;visibility:visible;mso-wrap-style:square;mso-width-percent:0;mso-height-percent:0;mso-wrap-distance-left:0;mso-wrap-distance-top:0;mso-wrap-distance-right:0;mso-wrap-distance-bottom:0;mso-position-horizontal:absolute;mso-position-horizontal-relative:page;mso-position-vertical:absolute;mso-position-vertical-relative:text;mso-width-percent:0;mso-height-percent:0;mso-width-relative:page;mso-height-relative:page;v-text-anchor:top" coordsize="9362,20" o:gfxdata="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" o:allowincell="f" path="m,l9362,e" filled="f" strokeweight=".16931mm">
                 <v:path arrowok="t" o:connecttype="custom" o:connectlocs="0,0;5944235,0" o:connectangles="0,0"/>
@@ -803,7 +803,7 @@
               </wp:anchor>
             </w:drawing>
           </mc:Choice>
-          <mc:Fallback xmlns:w16sdtfl="http://schemas.microsoft.com/office/word/2024/wordml/sdtformatlock" xmlns:w16du="http://schemas.microsoft.com/office/word/2023/wordml/word16du">
+          <mc:Fallback xmlns:w16du="http://schemas.microsoft.com/office/word/2023/wordml/word16du" xmlns:w16sdtfl="http://schemas.microsoft.com/office/word/2024/wordml/sdtformatlock">
             <w:pict>
               <v:shape w14:anchorId="2D99E0AF" id="Freeform 38" o:spid="_x0000_s1026" style="position:absolute;margin-left:78.95pt;margin-top:12.1pt;width:468.05pt;height:0;z-index:251656192;visibility:visible;mso-wrap-style:square;mso-width-percent:0;mso-height-percent:0;mso-wrap-distance-left:0;mso-wrap-distance-top:0;mso-wrap-distance-right:0;mso-wrap-distance-bottom:0;mso-position-horizontal:absolute;mso-position-horizontal-relative:page;mso-position-vertical:absolute;mso-position-vertical-relative:text;mso-width-percent:0;mso-height-percent:0;mso-width-relative:page;mso-height-relative:page;v-text-anchor:top" coordsize="9362,20" o:gfxdata="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" o:allowincell="f" path="m,l9362,e" filled="f" strokeweight=".48pt">
                 <v:path arrowok="t" o:connecttype="custom" o:connectlocs="0,0;5944235,0" o:connectangles="0,0"/>
@@ -997,7 +997,7 @@
               </wp:inline>
             </w:drawing>
           </mc:Choice>
-          <mc:Fallback xmlns:w16sdtfl="http://schemas.microsoft.com/office/word/2024/wordml/sdtformatlock" xmlns:w16du="http://schemas.microsoft.com/office/word/2023/wordml/word16du">
+          <mc:Fallback xmlns:w16du="http://schemas.microsoft.com/office/word/2023/wordml/word16du" xmlns:w16sdtfl="http://schemas.microsoft.com/office/word/2024/wordml/sdtformatlock">
             <w:pict>
               <v:group w14:anchorId="363A1BA2" id="Group 39" o:spid="_x0000_s1026" style="width:468.1pt;height:1pt;mso-position-horizontal-relative:char;mso-position-vertical-relative:line" coordsize="9362,20" o:gfxdata="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">
                 <v:shape id="Freeform 40" o:spid="_x0000_s1027" style="position:absolute;top:4;width:9362;height:20;visibility:visible;mso-wrap-style:square;v-text-anchor:top" coordsize="9362,20" o:gfxdata="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" path="m,l9361,e" filled="f" strokeweight=".48pt">
@@ -1161,7 +1161,7 @@
               </wp:anchor>
             </w:drawing>
           </mc:Choice>
-          <mc:Fallback xmlns:w16sdtfl="http://schemas.microsoft.com/office/word/2024/wordml/sdtformatlock" xmlns:w16du="http://schemas.microsoft.com/office/word/2023/wordml/word16du">
+          <mc:Fallback xmlns:w16du="http://schemas.microsoft.com/office/word/2023/wordml/word16du" xmlns:w16sdtfl="http://schemas.microsoft.com/office/word/2024/wordml/sdtformatlock">
             <w:pict>
               <v:shape w14:anchorId="32F7A97A" id="Freeform 41" o:spid="_x0000_s1026" style="position:absolute;margin-left:78.95pt;margin-top:12.1pt;width:468.05pt;height:0;z-index:251657216;visibility:visible;mso-wrap-style:square;mso-width-percent:0;mso-height-percent:0;mso-wrap-distance-left:0;mso-wrap-distance-top:0;mso-wrap-distance-right:0;mso-wrap-distance-bottom:0;mso-position-horizontal:absolute;mso-position-horizontal-relative:page;mso-position-vertical:absolute;mso-position-vertical-relative:text;mso-width-percent:0;mso-height-percent:0;mso-width-relative:page;mso-height-relative:page;v-text-anchor:top" coordsize="9362,20" o:gfxdata="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" o:allowincell="f" path="m,l9362,e" filled="f" strokeweight=".48pt">
                 <v:path arrowok="t" o:connecttype="custom" o:connectlocs="0,0;5944235,0" o:connectangles="0,0"/>
@@ -1345,7 +1345,7 @@
               </wp:anchor>
             </w:drawing>
           </mc:Choice>
-          <mc:Fallback xmlns:w16sdtfl="http://schemas.microsoft.com/office/word/2024/wordml/sdtformatlock" xmlns:w16du="http://schemas.microsoft.com/office/word/2023/wordml/word16du">
+          <mc:Fallback xmlns:w16du="http://schemas.microsoft.com/office/word/2023/wordml/word16du" xmlns:w16sdtfl="http://schemas.microsoft.com/office/word/2024/wordml/sdtformatlock">
             <w:pict>
               <v:shape w14:anchorId="78105630" id="Freeform 42" o:spid="_x0000_s1026" style="position:absolute;margin-left:78.95pt;margin-top:40pt;width:468.55pt;height:0;z-index:-251657216;visibility:visible;mso-wrap-style:square;mso-width-percent:0;mso-height-percent:0;mso-wrap-distance-left:9pt;mso-wrap-distance-top:0;mso-wrap-distance-right:9pt;mso-wrap-distance-bottom:0;mso-position-horizontal:absolute;mso-position-horizontal-relative:page;mso-position-vertical:absolute;mso-position-vertical-relative:text;mso-width-percent:0;mso-height-percent:0;mso-width-relative:page;mso-height-relative:page;v-text-anchor:top" coordsize="9371,20" o:gfxdata="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" o:allowincell="f" path="m,l9371,e" filled="f" strokeweight=".48pt">
                 <v:path arrowok="t" o:connecttype="custom" o:connectlocs="0,0;5950585,0" o:connectangles="0,0"/>
@@ -1642,7 +1642,7 @@
               </wp:anchor>
             </w:drawing>
           </mc:Choice>
-          <mc:Fallback xmlns:w16sdtfl="http://schemas.microsoft.com/office/word/2024/wordml/sdtformatlock" xmlns:w16du="http://schemas.microsoft.com/office/word/2023/wordml/word16du">
+          <mc:Fallback xmlns:w16du="http://schemas.microsoft.com/office/word/2023/wordml/word16du" xmlns:w16sdtfl="http://schemas.microsoft.com/office/word/2024/wordml/sdtformatlock">
             <w:pict>
               <v:shape w14:anchorId="554BBCDF" id="Freeform 43" o:spid="_x0000_s1026" style="position:absolute;margin-left:78.95pt;margin-top:11.9pt;width:468.05pt;height:0;z-index:251658240;visibility:visible;mso-wrap-style:square;mso-width-percent:0;mso-height-percent:0;mso-wrap-distance-left:0;mso-wrap-distance-top:0;mso-wrap-distance-right:0;mso-wrap-distance-bottom:0;mso-position-horizontal:absolute;mso-position-horizontal-relative:page;mso-position-vertical:absolute;mso-position-vertical-relative:text;mso-width-percent:0;mso-height-percent:0;mso-width-relative:page;mso-height-relative:page;v-text-anchor:top" coordsize="9362,20" o:gfxdata="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" o:allowincell="f" path="m,l9362,e" filled="f" strokeweight=".16931mm">
                 <v:path arrowok="t" o:connecttype="custom" o:connectlocs="0,0;5944235,0" o:connectangles="0,0"/>
@@ -1878,7 +1878,7 @@
               </wp:anchor>
             </w:drawing>
           </mc:Choice>
-          <mc:Fallback xmlns:w16sdtfl="http://schemas.microsoft.com/office/word/2024/wordml/sdtformatlock" xmlns:w16du="http://schemas.microsoft.com/office/word/2023/wordml/word16du">
+          <mc:Fallback xmlns:w16du="http://schemas.microsoft.com/office/word/2023/wordml/word16du" xmlns:w16sdtfl="http://schemas.microsoft.com/office/word/2024/wordml/sdtformatlock">
             <w:pict>
               <v:shape w14:anchorId="24D39357" id="Freeform 43" o:spid="_x0000_s1026" style="position:absolute;margin-left:78.95pt;margin-top:11.9pt;width:468.05pt;height:0;z-index:251667456;visibility:visible;mso-wrap-style:square;mso-width-percent:0;mso-height-percent:0;mso-wrap-distance-left:0;mso-wrap-distance-top:0;mso-wrap-distance-right:0;mso-wrap-distance-bottom:0;mso-position-horizontal:absolute;mso-position-horizontal-relative:page;mso-position-vertical:absolute;mso-position-vertical-relative:text;mso-width-percent:0;mso-height-percent:0;mso-width-relative:page;mso-height-relative:page;v-text-anchor:top" coordsize="9362,20" o:gfxdata="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" o:allowincell="f" path="m,l9362,e" filled="f" strokeweight=".16931mm">
                 <v:path arrowok="t" o:connecttype="custom" o:connectlocs="0,0;5944235,0" o:connectangles="0,0"/>
@@ -2083,7 +2083,7 @@
               </wp:anchor>
             </w:drawing>
           </mc:Choice>
-          <mc:Fallback xmlns:w16sdtfl="http://schemas.microsoft.com/office/word/2024/wordml/sdtformatlock" xmlns:w16du="http://schemas.microsoft.com/office/word/2023/wordml/word16du">
+          <mc:Fallback xmlns:w16du="http://schemas.microsoft.com/office/word/2023/wordml/word16du" xmlns:w16sdtfl="http://schemas.microsoft.com/office/word/2024/wordml/sdtformatlock">
             <w:pict>
               <v:shape w14:anchorId="50548E26" id="Freeform 42" o:spid="_x0000_s1026" style="position:absolute;margin-left:78.95pt;margin-top:40pt;width:468.55pt;height:0;z-index:-251653120;visibility:visible;mso-wrap-style:square;mso-width-percent:0;mso-height-percent:0;mso-wrap-distance-left:9pt;mso-wrap-distance-top:0;mso-wrap-distance-right:9pt;mso-wrap-distance-bottom:0;mso-position-horizontal:absolute;mso-position-horizontal-relative:page;mso-position-vertical:absolute;mso-position-vertical-relative:text;mso-width-percent:0;mso-height-percent:0;mso-width-relative:page;mso-height-relative:page;v-text-anchor:top" coordsize="9371,20" o:gfxdata="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" o:allowincell="f" path="m,l9371,e" filled="f" strokeweight=".48pt">
                 <v:path arrowok="t" o:connecttype="custom" o:connectlocs="0,0;5950585,0" o:connectangles="0,0"/>
@@ -2189,7 +2189,7 @@
               </wp:anchor>
             </w:drawing>
           </mc:Choice>
-          <mc:Fallback xmlns:w16sdtfl="http://schemas.microsoft.com/office/word/2024/wordml/sdtformatlock" xmlns:w16du="http://schemas.microsoft.com/office/word/2023/wordml/word16du">
+          <mc:Fallback xmlns:w16du="http://schemas.microsoft.com/office/word/2023/wordml/word16du" xmlns:w16sdtfl="http://schemas.microsoft.com/office/word/2024/wordml/sdtformatlock">
             <w:pict>
               <v:shape w14:anchorId="6F48BCD1" id="Freeform 42" o:spid="_x0000_s1026" style="position:absolute;margin-left:78.95pt;margin-top:40pt;width:468.55pt;height:0;z-index:-251651072;visibility:visible;mso-wrap-style:square;mso-width-percent:0;mso-height-percent:0;mso-wrap-distance-left:9pt;mso-wrap-distance-top:0;mso-wrap-distance-right:9pt;mso-wrap-distance-bottom:0;mso-position-horizontal:absolute;mso-position-horizontal-relative:page;mso-position-vertical:absolute;mso-position-vertical-relative:text;mso-width-percent:0;mso-height-percent:0;mso-width-relative:page;mso-height-relative:page;v-text-anchor:top" coordsize="9371,20" o:gfxdata="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" o:allowincell="f" path="m,l9371,e" filled="f" strokeweight=".48pt">
                 <v:path arrowok="t" o:connecttype="custom" o:connectlocs="0,0;5950585,0" o:connectangles="0,0"/>
@@ -2608,7 +2608,7 @@
               </wp:inline>
             </w:drawing>
           </mc:Choice>
-          <mc:Fallback xmlns:w16sdtfl="http://schemas.microsoft.com/office/word/2024/wordml/sdtformatlock" xmlns:w16du="http://schemas.microsoft.com/office/word/2023/wordml/word16du">
+          <mc:Fallback xmlns:w16du="http://schemas.microsoft.com/office/word/2023/wordml/word16du" xmlns:w16sdtfl="http://schemas.microsoft.com/office/word/2024/wordml/sdtformatlock">
             <w:pict>
               <v:group w14:anchorId="3D3C569E" id="Group 48" o:spid="_x0000_s1026" style="width:407.35pt;height:3.55pt;mso-position-horizontal-relative:char;mso-position-vertical-relative:line" coordsize="7528,20" o:gfxdata="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">
                 <v:shape id="Freeform 49" o:spid="_x0000_s1027" style="position:absolute;top:4;width:7528;height:20;visibility:visible;mso-wrap-style:square;v-text-anchor:top" coordsize="7528,20" o:gfxdata="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" path="m,l7527,e" filled="f" strokeweight=".16931mm">
@@ -2838,7 +2838,7 @@
               </wp:inline>
             </w:drawing>
           </mc:Choice>
-          <mc:Fallback xmlns:w16sdtfl="http://schemas.microsoft.com/office/word/2024/wordml/sdtformatlock" xmlns:w16du="http://schemas.microsoft.com/office/word/2023/wordml/word16du">
+          <mc:Fallback xmlns:w16du="http://schemas.microsoft.com/office/word/2023/wordml/word16du" xmlns:w16sdtfl="http://schemas.microsoft.com/office/word/2024/wordml/sdtformatlock">
             <w:pict>
               <v:group w14:anchorId="1B3852B8" id="Group 48" o:spid="_x0000_s1026" style="width:407.35pt;height:3.55pt;mso-position-horizontal-relative:char;mso-position-vertical-relative:line" coordsize="7528,20" o:gfxdata="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">
                 <v:shape id="Freeform 49" o:spid="_x0000_s1027" style="position:absolute;top:4;width:7528;height:20;visibility:visible;mso-wrap-style:square;v-text-anchor:top" coordsize="7528,20" o:gfxdata="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" path="m,l7527,e" filled="f" strokeweight=".16931mm">
@@ -2994,7 +2994,7 @@
               </wp:inline>
             </w:drawing>
           </mc:Choice>
-          <mc:Fallback xmlns:w16sdtfl="http://schemas.microsoft.com/office/word/2024/wordml/sdtformatlock" xmlns:w16du="http://schemas.microsoft.com/office/word/2023/wordml/word16du">
+          <mc:Fallback xmlns:w16du="http://schemas.microsoft.com/office/word/2023/wordml/word16du" xmlns:w16sdtfl="http://schemas.microsoft.com/office/word/2024/wordml/sdtformatlock">
             <w:pict>
               <v:group w14:anchorId="75E850EF" id="Group 52" o:spid="_x0000_s1026" style="width:407.35pt;height:3.55pt;mso-position-horizontal-relative:char;mso-position-vertical-relative:line" coordsize="7528,20" o:gfxdata="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">
                 <v:shape id="Freeform 53" o:spid="_x0000_s1027" style="position:absolute;top:4;width:7528;height:20;visibility:visible;mso-wrap-style:square;v-text-anchor:top" coordsize="7528,20" o:gfxdata="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" path="m,l7527,e" filled="f" strokeweight=".16931mm">
@@ -3096,42 +3096,10 @@
         <w:tab/>
       </w:r>
       <w:r>
-        <w:tab/>
-      </w:r>
-      <w:r>
         <w:rPr>
           <w:webHidden/>
         </w:rPr>
-        <w:fldChar w:fldCharType="begin"/>
-      </w:r>
-      <w:r>
-        <w:rPr>
-          <w:webHidden/>
-        </w:rPr>
-        <w:instrText xml:space="preserve"> PAGEREF _Toc506483744 \h </w:instrText>
-      </w:r>
-      <w:r>
-        <w:rPr>
-          <w:webHidden/>
-        </w:rPr>
-      </w:r>
-      <w:r>
-        <w:rPr>
-          <w:webHidden/>
-        </w:rPr>
-        <w:fldChar w:fldCharType="separate"/>
-      </w:r>
-      <w:r>
-        <w:rPr>
-          <w:webHidden/>
-        </w:rPr>
         <w:t>3</w:t>
-      </w:r>
-      <w:r>
-        <w:rPr>
-          <w:webHidden/>
-        </w:rPr>
-        <w:fldChar w:fldCharType="end"/>
       </w:r>
     </w:p>
     <w:p>
@@ -3144,12 +3112,14 @@
         <w:rPr>
           <w:rStyle w:val="af0"/>
           <w:color w:val="auto"/>
+          <w:u w:val="none"/>
         </w:rPr>
       </w:pPr>
       <w:r>
         <w:rPr>
           <w:rStyle w:val="af0"/>
           <w:color w:val="auto"/>
+          <w:u w:val="none"/>
         </w:rPr>
         <w:t>Ход работы</w:t>
       </w:r>
@@ -3157,13 +3127,7 @@
         <w:rPr>
           <w:rStyle w:val="af0"/>
           <w:color w:val="auto"/>
-        </w:rPr>
-        <w:tab/>
-      </w:r>
-      <w:r>
-        <w:rPr>
-          <w:rStyle w:val="af0"/>
-          <w:color w:val="auto"/>
+          <w:u w:val="none"/>
         </w:rPr>
         <w:tab/>
         <w:t>4</w:t>
@@ -3182,6 +3146,7 @@
           <w:rPr>
             <w:rStyle w:val="af0"/>
             <w:color w:val="auto"/>
+            <w:u w:val="none"/>
           </w:rPr>
           <w:t>Изучение уязвимости</w:t>
         </w:r>
@@ -3189,6 +3154,7 @@
           <w:rPr>
             <w:rStyle w:val="af0"/>
             <w:color w:val="auto"/>
+            <w:u w:val="none"/>
             <w:lang w:val="en-US"/>
           </w:rPr>
           <w:t xml:space="preserve"> CVE-2024-21413</w:t>
@@ -3197,13 +3163,7 @@
           <w:rPr>
             <w:rStyle w:val="af0"/>
             <w:color w:val="auto"/>
-          </w:rPr>
-          <w:tab/>
-        </w:r>
-        <w:r>
-          <w:rPr>
-            <w:rStyle w:val="af0"/>
-            <w:color w:val="auto"/>
+            <w:u w:val="none"/>
           </w:rPr>
           <w:tab/>
         </w:r>
@@ -3212,6 +3172,7 @@
             <w:rStyle w:val="af0"/>
             <w:webHidden/>
             <w:color w:val="auto"/>
+            <w:u w:val="none"/>
           </w:rPr>
           <w:t>4</w:t>
         </w:r>
@@ -3229,6 +3190,7 @@
         <w:rPr>
           <w:rStyle w:val="af0"/>
           <w:color w:val="auto"/>
+          <w:u w:val="none"/>
         </w:rPr>
         <w:t>Подготовка лабораторного стенда</w:t>
       </w:r>
@@ -3236,13 +3198,7 @@
         <w:rPr>
           <w:rStyle w:val="af0"/>
           <w:color w:val="auto"/>
-        </w:rPr>
-        <w:tab/>
-      </w:r>
-      <w:r>
-        <w:rPr>
-          <w:rStyle w:val="af0"/>
-          <w:color w:val="auto"/>
+          <w:u w:val="none"/>
         </w:rPr>
         <w:tab/>
       </w:r>
@@ -3251,6 +3207,7 @@
           <w:rStyle w:val="af0"/>
           <w:webHidden/>
           <w:color w:val="auto"/>
+          <w:u w:val="none"/>
         </w:rPr>
         <w:t>7</w:t>
       </w:r>
@@ -3270,6 +3227,7 @@
         <w:rPr>
           <w:rStyle w:val="af0"/>
           <w:color w:val="auto"/>
+          <w:u w:val="none"/>
         </w:rPr>
         <w:t>Воспроизведение уязвимости</w:t>
       </w:r>
@@ -3277,13 +3235,7 @@
         <w:rPr>
           <w:rStyle w:val="af0"/>
           <w:color w:val="auto"/>
-        </w:rPr>
-        <w:tab/>
-      </w:r>
-      <w:r>
-        <w:rPr>
-          <w:rStyle w:val="af0"/>
-          <w:color w:val="auto"/>
+          <w:u w:val="none"/>
         </w:rPr>
         <w:tab/>
       </w:r>
@@ -3306,6 +3258,7 @@
         <w:rPr>
           <w:rStyle w:val="af0"/>
           <w:color w:val="auto"/>
+          <w:u w:val="none"/>
         </w:rPr>
         <w:t>Исследование процесса обработки ссылки</w:t>
       </w:r>
@@ -3313,13 +3266,7 @@
         <w:rPr>
           <w:rStyle w:val="af0"/>
           <w:color w:val="auto"/>
-        </w:rPr>
-        <w:tab/>
-      </w:r>
-      <w:r>
-        <w:rPr>
-          <w:rStyle w:val="af0"/>
-          <w:color w:val="auto"/>
+          <w:u w:val="none"/>
         </w:rPr>
         <w:tab/>
       </w:r>
@@ -3340,13 +3287,11 @@
         <w:rPr>
           <w:rStyle w:val="af0"/>
           <w:color w:val="auto"/>
+          <w:u w:val="none"/>
         </w:rPr>
       </w:pPr>
       <w:r>
         <w:t>Выводы</w:t>
-      </w:r>
-      <w:r>
-        <w:tab/>
       </w:r>
       <w:r>
         <w:tab/>
@@ -3368,12 +3313,14 @@
         <w:rPr>
           <w:rStyle w:val="af0"/>
           <w:color w:val="auto"/>
+          <w:u w:val="none"/>
         </w:rPr>
       </w:pPr>
       <w:r>
         <w:rPr>
           <w:rStyle w:val="af0"/>
           <w:color w:val="auto"/>
+          <w:u w:val="none"/>
         </w:rPr>
         <w:t>Список использованных источников</w:t>
       </w:r>
@@ -3381,13 +3328,7 @@
         <w:rPr>
           <w:rStyle w:val="af0"/>
           <w:color w:val="auto"/>
-        </w:rPr>
-        <w:tab/>
-      </w:r>
-      <w:r>
-        <w:rPr>
-          <w:rStyle w:val="af0"/>
-          <w:color w:val="auto"/>
+          <w:u w:val="none"/>
         </w:rPr>
         <w:tab/>
       </w:r>
@@ -3409,35 +3350,30 @@
         <w:rPr>
           <w:rStyle w:val="af0"/>
           <w:color w:val="auto"/>
+          <w:u w:val="none"/>
         </w:rPr>
       </w:pPr>
       <w:r>
         <w:rPr>
           <w:rStyle w:val="af0"/>
           <w:color w:val="auto"/>
+          <w:u w:val="none"/>
         </w:rPr>
         <w:t>Приложение А</w:t>
       </w:r>
-      <w:hyperlink r:id="rId13" w:anchor="_Toc506483745" w:history="1">
-        <w:r>
-          <w:rPr>
-            <w:rStyle w:val="af0"/>
-            <w:color w:val="auto"/>
-          </w:rPr>
-          <w:tab/>
-        </w:r>
-        <w:r>
-          <w:rPr>
-            <w:rStyle w:val="af0"/>
-            <w:color w:val="auto"/>
-          </w:rPr>
-          <w:tab/>
-        </w:r>
-      </w:hyperlink>
       <w:r>
         <w:rPr>
           <w:rStyle w:val="af0"/>
           <w:color w:val="auto"/>
+          <w:u w:val="none"/>
+        </w:rPr>
+        <w:tab/>
+      </w:r>
+      <w:r>
+        <w:rPr>
+          <w:rStyle w:val="af0"/>
+          <w:color w:val="auto"/>
+          <w:u w:val="none"/>
         </w:rPr>
         <w:t>16</w:t>
       </w:r>
@@ -4206,7 +4142,7 @@
                     <pic:cNvPicPr/>
                   </pic:nvPicPr>
                   <pic:blipFill>
-                    <a:blip r:embed="rId14"/>
+                    <a:blip r:embed="rId13"/>
                     <a:stretch>
                       <a:fillRect/>
                     </a:stretch>
@@ -4573,7 +4509,7 @@
                     </pic:cNvPicPr>
                   </pic:nvPicPr>
                   <pic:blipFill>
-                    <a:blip r:embed="rId15">
+                    <a:blip r:embed="rId14">
                       <a:extLst>
                         <a:ext uri="{28A0092B-C50C-407E-A947-70E740481C1C}">
                           <a14:useLocalDpi xmlns:a14="http://schemas.microsoft.com/office/drawing/2010/main" val="0"/>
@@ -5616,7 +5552,7 @@
                     <pic:cNvPicPr/>
                   </pic:nvPicPr>
                   <pic:blipFill rotWithShape="1">
-                    <a:blip r:embed="rId16"/>
+                    <a:blip r:embed="rId15"/>
                     <a:srcRect r="41310"/>
                     <a:stretch/>
                   </pic:blipFill>
@@ -5721,7 +5657,7 @@
                     </pic:cNvPicPr>
                   </pic:nvPicPr>
                   <pic:blipFill>
-                    <a:blip r:embed="rId17">
+                    <a:blip r:embed="rId16">
                       <a:extLst>
                         <a:ext uri="{28A0092B-C50C-407E-A947-70E740481C1C}">
                           <a14:useLocalDpi xmlns:a14="http://schemas.microsoft.com/office/drawing/2010/main" val="0"/>
@@ -5891,7 +5827,7 @@
                     <pic:cNvPicPr/>
                   </pic:nvPicPr>
                   <pic:blipFill>
-                    <a:blip r:embed="rId18"/>
+                    <a:blip r:embed="rId17"/>
                     <a:stretch>
                       <a:fillRect/>
                     </a:stretch>
@@ -6100,7 +6036,7 @@
         </w:rPr>
         <w:t xml:space="preserve">. Почта жертвы будет: </w:t>
       </w:r>
-      <w:hyperlink r:id="rId19" w:history="1">
+      <w:hyperlink r:id="rId18" w:history="1">
         <w:r>
           <w:rPr>
             <w:rStyle w:val="af0"/>
@@ -6164,7 +6100,7 @@
         </w:rPr>
         <w:t xml:space="preserve">, а атакующего: </w:t>
       </w:r>
-      <w:hyperlink r:id="rId20" w:history="1">
+      <w:hyperlink r:id="rId19" w:history="1">
         <w:r>
           <w:rPr>
             <w:rStyle w:val="af0"/>
@@ -6269,7 +6205,7 @@
                     <pic:cNvPicPr/>
                   </pic:nvPicPr>
                   <pic:blipFill>
-                    <a:blip r:embed="rId21"/>
+                    <a:blip r:embed="rId20"/>
                     <a:stretch>
                       <a:fillRect/>
                     </a:stretch>
@@ -6541,6 +6477,181 @@
             <wp:extent cx="4259580" cy="3095507"/>
             <wp:effectExtent l="0" t="0" r="7620" b="0"/>
             <wp:docPr id="33" name="Рисунок 33"/>
+            <wp:cNvGraphicFramePr>
+              <a:graphicFrameLocks xmlns:a="http://schemas.openxmlformats.org/drawingml/2006/main" noChangeAspect="1"/>
+            </wp:cNvGraphicFramePr>
+            <a:graphic xmlns:a="http://schemas.openxmlformats.org/drawingml/2006/main">
+              <a:graphicData uri="http://schemas.openxmlformats.org/drawingml/2006/picture">
+                <pic:pic xmlns:pic="http://schemas.openxmlformats.org/drawingml/2006/picture">
+                  <pic:nvPicPr>
+                    <pic:cNvPr id="1" name=""/>
+                    <pic:cNvPicPr/>
+                  </pic:nvPicPr>
+                  <pic:blipFill>
+                    <a:blip r:embed="rId21"/>
+                    <a:stretch>
+                      <a:fillRect/>
+                    </a:stretch>
+                  </pic:blipFill>
+                  <pic:spPr>
+                    <a:xfrm>
+                      <a:off x="0" y="0"/>
+                      <a:ext cx="4263974" cy="3098701"/>
+                    </a:xfrm>
+                    <a:prstGeom prst="rect">
+                      <a:avLst/>
+                    </a:prstGeom>
+                  </pic:spPr>
+                </pic:pic>
+              </a:graphicData>
+            </a:graphic>
+          </wp:inline>
+        </w:drawing>
+      </w:r>
+      <w:r>
+        <w:rPr>
+          <w:rFonts w:ascii="Times New Roman" w:hAnsi="Times New Roman" w:cs="Times New Roman"/>
+          <w:bCs/>
+          <w:sz w:val="28"/>
+          <w:szCs w:val="28"/>
+        </w:rPr>
+        <w:br/>
+      </w:r>
+      <w:r>
+        <w:rPr>
+          <w:rFonts w:ascii="Times New Roman" w:hAnsi="Times New Roman" w:cs="Times New Roman"/>
+          <w:bCs/>
+          <w:sz w:val="28"/>
+          <w:szCs w:val="28"/>
+        </w:rPr>
+        <w:t xml:space="preserve">Рисунок 6. </w:t>
+      </w:r>
+      <w:r>
+        <w:rPr>
+          <w:rFonts w:ascii="Times New Roman" w:hAnsi="Times New Roman" w:cs="Times New Roman"/>
+          <w:bCs/>
+          <w:sz w:val="28"/>
+          <w:szCs w:val="28"/>
+          <w:lang w:val="en-US"/>
+        </w:rPr>
+        <w:t>Outlook</w:t>
+      </w:r>
+      <w:r>
+        <w:rPr>
+          <w:rFonts w:ascii="Times New Roman" w:hAnsi="Times New Roman" w:cs="Times New Roman"/>
+          <w:bCs/>
+          <w:sz w:val="28"/>
+          <w:szCs w:val="28"/>
+        </w:rPr>
+        <w:t xml:space="preserve"> жертвы</w:t>
+      </w:r>
+    </w:p>
+    <w:p>
+      <w:pPr>
+        <w:pStyle w:val="af"/>
+        <w:spacing w:line="360" w:lineRule="auto"/>
+        <w:ind w:firstLine="851"/>
+        <w:jc w:val="both"/>
+        <w:rPr>
+          <w:rFonts w:ascii="Times New Roman" w:hAnsi="Times New Roman" w:cs="Times New Roman"/>
+          <w:bCs/>
+          <w:sz w:val="28"/>
+          <w:szCs w:val="28"/>
+        </w:rPr>
+      </w:pPr>
+      <w:r>
+        <w:rPr>
+          <w:rFonts w:ascii="Times New Roman" w:hAnsi="Times New Roman" w:cs="Times New Roman"/>
+          <w:bCs/>
+          <w:sz w:val="28"/>
+          <w:szCs w:val="28"/>
+        </w:rPr>
+        <w:t xml:space="preserve">Откроем на машине злоумышленника </w:t>
+      </w:r>
+      <w:r>
+        <w:rPr>
+          <w:rFonts w:ascii="Times New Roman" w:hAnsi="Times New Roman" w:cs="Times New Roman"/>
+          <w:bCs/>
+          <w:sz w:val="28"/>
+          <w:szCs w:val="28"/>
+          <w:lang w:val="en-US"/>
+        </w:rPr>
+        <w:t>responder</w:t>
+      </w:r>
+      <w:r>
+        <w:rPr>
+          <w:rFonts w:ascii="Times New Roman" w:hAnsi="Times New Roman" w:cs="Times New Roman"/>
+          <w:bCs/>
+          <w:sz w:val="28"/>
+          <w:szCs w:val="28"/>
+        </w:rPr>
+        <w:t xml:space="preserve"> </w:t>
+      </w:r>
+      <w:r>
+        <w:rPr>
+          <w:rFonts w:ascii="Times New Roman" w:hAnsi="Times New Roman" w:cs="Times New Roman"/>
+          <w:bCs/>
+          <w:sz w:val="28"/>
+          <w:szCs w:val="28"/>
+        </w:rPr>
+        <w:t xml:space="preserve">для создания </w:t>
+      </w:r>
+      <w:r>
+        <w:rPr>
+          <w:rFonts w:ascii="Times New Roman" w:hAnsi="Times New Roman" w:cs="Times New Roman"/>
+          <w:bCs/>
+          <w:sz w:val="28"/>
+          <w:szCs w:val="28"/>
+          <w:lang w:val="en-US"/>
+        </w:rPr>
+        <w:t>SMB</w:t>
+      </w:r>
+      <w:r>
+        <w:rPr>
+          <w:rFonts w:ascii="Times New Roman" w:hAnsi="Times New Roman" w:cs="Times New Roman"/>
+          <w:bCs/>
+          <w:sz w:val="28"/>
+          <w:szCs w:val="28"/>
+        </w:rPr>
+        <w:t xml:space="preserve"> </w:t>
+      </w:r>
+      <w:r>
+        <w:rPr>
+          <w:rFonts w:ascii="Times New Roman" w:hAnsi="Times New Roman" w:cs="Times New Roman"/>
+          <w:bCs/>
+          <w:sz w:val="28"/>
+          <w:szCs w:val="28"/>
+        </w:rPr>
+        <w:t>подключения и отслеживания хэша.</w:t>
+      </w:r>
+    </w:p>
+    <w:p>
+      <w:pPr>
+        <w:pStyle w:val="af"/>
+        <w:spacing w:line="360" w:lineRule="auto"/>
+        <w:jc w:val="center"/>
+        <w:rPr>
+          <w:rFonts w:ascii="Times New Roman" w:hAnsi="Times New Roman" w:cs="Times New Roman"/>
+          <w:bCs/>
+          <w:sz w:val="28"/>
+          <w:szCs w:val="28"/>
+          <w:lang w:val="en-US"/>
+        </w:rPr>
+      </w:pPr>
+      <w:r>
+        <w:rPr>
+          <w:rFonts w:ascii="Times New Roman" w:hAnsi="Times New Roman" w:cs="Times New Roman"/>
+          <w:bCs/>
+          <w:noProof/>
+          <w:sz w:val="28"/>
+          <w:szCs w:val="28"/>
+          <w:lang w:val="en-US"/>
+        </w:rPr>
+        <w:drawing>
+          <wp:inline distT="0" distB="0" distL="0" distR="0" wp14:anchorId="4C6E21F3" wp14:editId="38194F21">
+            <wp:extent cx="5563082" cy="3734124"/>
+            <wp:effectExtent l="0" t="0" r="0" b="0"/>
+            <wp:docPr id="34" name="Рисунок 34"/>
             <wp:cNvGraphicFramePr>
               <a:graphicFrameLocks xmlns:a="http://schemas.openxmlformats.org/drawingml/2006/main" noChangeAspect="1"/>
             </wp:cNvGraphicFramePr>
@@ -6560,7 +6671,7 @@
                   <pic:spPr>
                     <a:xfrm>
                       <a:off x="0" y="0"/>
-                      <a:ext cx="4263974" cy="3098701"/>
+                      <a:ext cx="5563082" cy="3734124"/>
                     </a:xfrm>
                     <a:prstGeom prst="rect">
                       <a:avLst/>
@@ -6572,42 +6683,74 @@
           </wp:inline>
         </w:drawing>
       </w:r>
-      <w:r>
-        <w:rPr>
-          <w:rFonts w:ascii="Times New Roman" w:hAnsi="Times New Roman" w:cs="Times New Roman"/>
-          <w:bCs/>
-          <w:sz w:val="28"/>
-          <w:szCs w:val="28"/>
-        </w:rPr>
-        <w:br/>
-      </w:r>
-      <w:r>
-        <w:rPr>
-          <w:rFonts w:ascii="Times New Roman" w:hAnsi="Times New Roman" w:cs="Times New Roman"/>
-          <w:bCs/>
-          <w:sz w:val="28"/>
-          <w:szCs w:val="28"/>
-        </w:rPr>
-        <w:t xml:space="preserve">Рисунок 6. </w:t>
-      </w:r>
-      <w:r>
-        <w:rPr>
-          <w:rFonts w:ascii="Times New Roman" w:hAnsi="Times New Roman" w:cs="Times New Roman"/>
-          <w:bCs/>
-          <w:sz w:val="28"/>
-          <w:szCs w:val="28"/>
-          <w:lang w:val="en-US"/>
-        </w:rPr>
-        <w:t>Outlook</w:t>
-      </w:r>
-      <w:r>
-        <w:rPr>
-          <w:rFonts w:ascii="Times New Roman" w:hAnsi="Times New Roman" w:cs="Times New Roman"/>
-          <w:bCs/>
-          <w:sz w:val="28"/>
-          <w:szCs w:val="28"/>
-        </w:rPr>
-        <w:t xml:space="preserve"> жертвы</w:t>
+    </w:p>
+    <w:p>
+      <w:pPr>
+        <w:pStyle w:val="af"/>
+        <w:spacing w:line="360" w:lineRule="auto"/>
+        <w:jc w:val="center"/>
+        <w:rPr>
+          <w:rFonts w:ascii="Times New Roman" w:hAnsi="Times New Roman" w:cs="Times New Roman"/>
+          <w:bCs/>
+          <w:sz w:val="28"/>
+          <w:szCs w:val="28"/>
+        </w:rPr>
+      </w:pPr>
+      <w:r>
+        <w:rPr>
+          <w:rFonts w:ascii="Times New Roman" w:hAnsi="Times New Roman" w:cs="Times New Roman"/>
+          <w:bCs/>
+          <w:sz w:val="28"/>
+          <w:szCs w:val="28"/>
+        </w:rPr>
+        <w:t xml:space="preserve">Рисунок 7. Использование </w:t>
+      </w:r>
+      <w:r>
+        <w:rPr>
+          <w:rFonts w:ascii="Times New Roman" w:hAnsi="Times New Roman" w:cs="Times New Roman"/>
+          <w:bCs/>
+          <w:sz w:val="28"/>
+          <w:szCs w:val="28"/>
+          <w:lang w:val="en-US"/>
+        </w:rPr>
+        <w:t>responder</w:t>
+      </w:r>
+      <w:r>
+        <w:rPr>
+          <w:rFonts w:ascii="Times New Roman" w:hAnsi="Times New Roman" w:cs="Times New Roman"/>
+          <w:bCs/>
+          <w:sz w:val="28"/>
+          <w:szCs w:val="28"/>
+        </w:rPr>
+        <w:t xml:space="preserve"> </w:t>
+      </w:r>
+      <w:r>
+        <w:rPr>
+          <w:rFonts w:ascii="Times New Roman" w:hAnsi="Times New Roman" w:cs="Times New Roman"/>
+          <w:bCs/>
+          <w:sz w:val="28"/>
+          <w:szCs w:val="28"/>
+        </w:rPr>
+        <w:t xml:space="preserve">для создания </w:t>
+      </w:r>
+      <w:r>
+        <w:rPr>
+          <w:rFonts w:ascii="Times New Roman" w:hAnsi="Times New Roman" w:cs="Times New Roman"/>
+          <w:bCs/>
+          <w:sz w:val="28"/>
+          <w:szCs w:val="28"/>
+          <w:lang w:val="en-US"/>
+        </w:rPr>
+        <w:t>SMB</w:t>
+      </w:r>
+      <w:r>
+        <w:rPr>
+          <w:rFonts w:ascii="Times New Roman" w:hAnsi="Times New Roman" w:cs="Times New Roman"/>
+          <w:bCs/>
+          <w:sz w:val="28"/>
+          <w:szCs w:val="28"/>
+        </w:rPr>
+        <w:t xml:space="preserve"> порта</w:t>
       </w:r>
     </w:p>
     <w:p>
@@ -6630,18 +6773,40 @@
           <w:sz w:val="28"/>
           <w:szCs w:val="28"/>
         </w:rPr>
-        <w:t xml:space="preserve">Откроем на машине злоумышленника </w:t>
-      </w:r>
-      <w:r>
-        <w:rPr>
-          <w:rFonts w:ascii="Times New Roman" w:hAnsi="Times New Roman" w:cs="Times New Roman"/>
-          <w:bCs/>
-          <w:sz w:val="28"/>
-          <w:szCs w:val="28"/>
-          <w:lang w:val="en-US"/>
-        </w:rPr>
-        <w:t>responder</w:t>
-      </w:r>
+        <w:lastRenderedPageBreak/>
+        <w:t xml:space="preserve">В скрипте </w:t>
+      </w:r>
+      <w:r>
+        <w:rPr>
+          <w:rFonts w:ascii="Times New Roman" w:hAnsi="Times New Roman" w:cs="Times New Roman"/>
+          <w:bCs/>
+          <w:sz w:val="28"/>
+          <w:szCs w:val="28"/>
+          <w:lang w:val="en-US"/>
+        </w:rPr>
+        <w:t>exploit</w:t>
+      </w:r>
+      <w:r>
+        <w:rPr>
+          <w:rFonts w:ascii="Times New Roman" w:hAnsi="Times New Roman" w:cs="Times New Roman"/>
+          <w:bCs/>
+          <w:sz w:val="28"/>
+          <w:szCs w:val="28"/>
+        </w:rPr>
+        <w:t>.</w:t>
+      </w:r>
+      <w:proofErr w:type="spellStart"/>
+      <w:r>
+        <w:rPr>
+          <w:rFonts w:ascii="Times New Roman" w:hAnsi="Times New Roman" w:cs="Times New Roman"/>
+          <w:bCs/>
+          <w:sz w:val="28"/>
+          <w:szCs w:val="28"/>
+          <w:lang w:val="en-US"/>
+        </w:rPr>
+        <w:t>py</w:t>
+      </w:r>
+      <w:proofErr w:type="spellEnd"/>
       <w:r>
         <w:rPr>
           <w:rFonts w:ascii="Times New Roman" w:hAnsi="Times New Roman" w:cs="Times New Roman"/>
@@ -6658,17 +6823,17 @@
           <w:sz w:val="28"/>
           <w:szCs w:val="28"/>
         </w:rPr>
-        <w:t xml:space="preserve">для создания </w:t>
-      </w:r>
-      <w:r>
-        <w:rPr>
-          <w:rFonts w:ascii="Times New Roman" w:hAnsi="Times New Roman" w:cs="Times New Roman"/>
-          <w:bCs/>
-          <w:sz w:val="28"/>
-          <w:szCs w:val="28"/>
-          <w:lang w:val="en-US"/>
-        </w:rPr>
-        <w:t>SMB</w:t>
+        <w:t xml:space="preserve">заменим </w:t>
+      </w:r>
+      <w:r>
+        <w:rPr>
+          <w:rFonts w:ascii="Times New Roman" w:hAnsi="Times New Roman" w:cs="Times New Roman"/>
+          <w:bCs/>
+          <w:sz w:val="28"/>
+          <w:szCs w:val="28"/>
+          <w:lang w:val="en-US"/>
+        </w:rPr>
+        <w:t>IP</w:t>
       </w:r>
       <w:r>
         <w:rPr>
@@ -6686,7 +6851,63 @@
           <w:sz w:val="28"/>
           <w:szCs w:val="28"/>
         </w:rPr>
-        <w:t>подключения и отслеживания хэша.</w:t>
+        <w:t xml:space="preserve">адрес в отправляемой ссылке на тот, который принадлежит злоумышленнику, чтобы при нажатии на ссылку </w:t>
+      </w:r>
+      <w:r>
+        <w:rPr>
+          <w:rFonts w:ascii="Times New Roman" w:hAnsi="Times New Roman" w:cs="Times New Roman"/>
+          <w:bCs/>
+          <w:sz w:val="28"/>
+          <w:szCs w:val="28"/>
+          <w:lang w:val="en-US"/>
+        </w:rPr>
+        <w:t>Moniker</w:t>
+      </w:r>
+      <w:r>
+        <w:rPr>
+          <w:rFonts w:ascii="Times New Roman" w:hAnsi="Times New Roman" w:cs="Times New Roman"/>
+          <w:bCs/>
+          <w:sz w:val="28"/>
+          <w:szCs w:val="28"/>
+        </w:rPr>
+        <w:t xml:space="preserve"> </w:t>
+      </w:r>
+      <w:r>
+        <w:rPr>
+          <w:rFonts w:ascii="Times New Roman" w:hAnsi="Times New Roman" w:cs="Times New Roman"/>
+          <w:bCs/>
+          <w:sz w:val="28"/>
+          <w:szCs w:val="28"/>
+        </w:rPr>
+        <w:t xml:space="preserve">собирался именно с этого </w:t>
+      </w:r>
+      <w:r>
+        <w:rPr>
+          <w:rFonts w:ascii="Times New Roman" w:hAnsi="Times New Roman" w:cs="Times New Roman"/>
+          <w:bCs/>
+          <w:sz w:val="28"/>
+          <w:szCs w:val="28"/>
+          <w:lang w:val="en-US"/>
+        </w:rPr>
+        <w:t>IP</w:t>
+      </w:r>
+      <w:r>
+        <w:rPr>
+          <w:rFonts w:ascii="Times New Roman" w:hAnsi="Times New Roman" w:cs="Times New Roman"/>
+          <w:bCs/>
+          <w:sz w:val="28"/>
+          <w:szCs w:val="28"/>
+        </w:rPr>
+        <w:t xml:space="preserve"> </w:t>
+      </w:r>
+      <w:r>
+        <w:rPr>
+          <w:rFonts w:ascii="Times New Roman" w:hAnsi="Times New Roman" w:cs="Times New Roman"/>
+          <w:bCs/>
+          <w:sz w:val="28"/>
+          <w:szCs w:val="28"/>
+        </w:rPr>
+        <w:t>адреса.</w:t>
       </w:r>
     </w:p>
     <w:p>
@@ -6699,7 +6920,6 @@
           <w:bCs/>
           <w:sz w:val="28"/>
           <w:szCs w:val="28"/>
-          <w:lang w:val="en-US"/>
         </w:rPr>
       </w:pPr>
       <w:r>
@@ -6712,10 +6932,10 @@
           <w:lang w:val="en-US"/>
         </w:rPr>
         <w:drawing>
-          <wp:inline distT="0" distB="0" distL="0" distR="0" wp14:anchorId="4C6E21F3" wp14:editId="38194F21">
-            <wp:extent cx="5563082" cy="3734124"/>
-            <wp:effectExtent l="0" t="0" r="0" b="0"/>
-            <wp:docPr id="34" name="Рисунок 34"/>
+          <wp:inline distT="0" distB="0" distL="0" distR="0" wp14:anchorId="31CD7BE3" wp14:editId="33167541">
+            <wp:extent cx="5189670" cy="967824"/>
+            <wp:effectExtent l="0" t="0" r="0" b="3810"/>
+            <wp:docPr id="38" name="Рисунок 38"/>
             <wp:cNvGraphicFramePr>
               <a:graphicFrameLocks xmlns:a="http://schemas.openxmlformats.org/drawingml/2006/main" noChangeAspect="1"/>
             </wp:cNvGraphicFramePr>
@@ -6735,7 +6955,7 @@
                   <pic:spPr>
                     <a:xfrm>
                       <a:off x="0" y="0"/>
-                      <a:ext cx="5563082" cy="3734124"/>
+                      <a:ext cx="5189670" cy="967824"/>
                     </a:xfrm>
                     <a:prstGeom prst="rect">
                       <a:avLst/>
@@ -6767,17 +6987,17 @@
           <w:sz w:val="28"/>
           <w:szCs w:val="28"/>
         </w:rPr>
-        <w:t xml:space="preserve">Рисунок 7. Использование </w:t>
-      </w:r>
-      <w:r>
-        <w:rPr>
-          <w:rFonts w:ascii="Times New Roman" w:hAnsi="Times New Roman" w:cs="Times New Roman"/>
-          <w:bCs/>
-          <w:sz w:val="28"/>
-          <w:szCs w:val="28"/>
-          <w:lang w:val="en-US"/>
-        </w:rPr>
-        <w:t>responder</w:t>
+        <w:t xml:space="preserve">Рисунок 8. </w:t>
+      </w:r>
+      <w:r>
+        <w:rPr>
+          <w:rFonts w:ascii="Times New Roman" w:hAnsi="Times New Roman" w:cs="Times New Roman"/>
+          <w:bCs/>
+          <w:sz w:val="28"/>
+          <w:szCs w:val="28"/>
+          <w:lang w:val="en-US"/>
+        </w:rPr>
+        <w:t>IP</w:t>
       </w:r>
       <w:r>
         <w:rPr>
@@ -6795,189 +7015,13 @@
           <w:sz w:val="28"/>
           <w:szCs w:val="28"/>
         </w:rPr>
-        <w:t xml:space="preserve">для создания </w:t>
-      </w:r>
-      <w:r>
-        <w:rPr>
-          <w:rFonts w:ascii="Times New Roman" w:hAnsi="Times New Roman" w:cs="Times New Roman"/>
-          <w:bCs/>
-          <w:sz w:val="28"/>
-          <w:szCs w:val="28"/>
-          <w:lang w:val="en-US"/>
-        </w:rPr>
-        <w:t>SMB</w:t>
-      </w:r>
-      <w:r>
-        <w:rPr>
-          <w:rFonts w:ascii="Times New Roman" w:hAnsi="Times New Roman" w:cs="Times New Roman"/>
-          <w:bCs/>
-          <w:sz w:val="28"/>
-          <w:szCs w:val="28"/>
-        </w:rPr>
-        <w:t xml:space="preserve"> порта</w:t>
+        <w:t>адрес злоумышленника</w:t>
       </w:r>
     </w:p>
     <w:p>
       <w:pPr>
         <w:pStyle w:val="af"/>
         <w:spacing w:line="360" w:lineRule="auto"/>
-        <w:ind w:firstLine="851"/>
-        <w:jc w:val="both"/>
-        <w:rPr>
-          <w:rFonts w:ascii="Times New Roman" w:hAnsi="Times New Roman" w:cs="Times New Roman"/>
-          <w:bCs/>
-          <w:sz w:val="28"/>
-          <w:szCs w:val="28"/>
-        </w:rPr>
-      </w:pPr>
-      <w:r>
-        <w:rPr>
-          <w:rFonts w:ascii="Times New Roman" w:hAnsi="Times New Roman" w:cs="Times New Roman"/>
-          <w:bCs/>
-          <w:sz w:val="28"/>
-          <w:szCs w:val="28"/>
-        </w:rPr>
-        <w:lastRenderedPageBreak/>
-        <w:t xml:space="preserve">В скрипте </w:t>
-      </w:r>
-      <w:r>
-        <w:rPr>
-          <w:rFonts w:ascii="Times New Roman" w:hAnsi="Times New Roman" w:cs="Times New Roman"/>
-          <w:bCs/>
-          <w:sz w:val="28"/>
-          <w:szCs w:val="28"/>
-          <w:lang w:val="en-US"/>
-        </w:rPr>
-        <w:t>exploit</w:t>
-      </w:r>
-      <w:r>
-        <w:rPr>
-          <w:rFonts w:ascii="Times New Roman" w:hAnsi="Times New Roman" w:cs="Times New Roman"/>
-          <w:bCs/>
-          <w:sz w:val="28"/>
-          <w:szCs w:val="28"/>
-        </w:rPr>
-        <w:t>.</w:t>
-      </w:r>
-      <w:proofErr w:type="spellStart"/>
-      <w:r>
-        <w:rPr>
-          <w:rFonts w:ascii="Times New Roman" w:hAnsi="Times New Roman" w:cs="Times New Roman"/>
-          <w:bCs/>
-          <w:sz w:val="28"/>
-          <w:szCs w:val="28"/>
-          <w:lang w:val="en-US"/>
-        </w:rPr>
-        <w:t>py</w:t>
-      </w:r>
-      <w:proofErr w:type="spellEnd"/>
-      <w:r>
-        <w:rPr>
-          <w:rFonts w:ascii="Times New Roman" w:hAnsi="Times New Roman" w:cs="Times New Roman"/>
-          <w:bCs/>
-          <w:sz w:val="28"/>
-          <w:szCs w:val="28"/>
-        </w:rPr>
-        <w:t xml:space="preserve"> </w:t>
-      </w:r>
-      <w:r>
-        <w:rPr>
-          <w:rFonts w:ascii="Times New Roman" w:hAnsi="Times New Roman" w:cs="Times New Roman"/>
-          <w:bCs/>
-          <w:sz w:val="28"/>
-          <w:szCs w:val="28"/>
-        </w:rPr>
-        <w:t xml:space="preserve">заменим </w:t>
-      </w:r>
-      <w:r>
-        <w:rPr>
-          <w:rFonts w:ascii="Times New Roman" w:hAnsi="Times New Roman" w:cs="Times New Roman"/>
-          <w:bCs/>
-          <w:sz w:val="28"/>
-          <w:szCs w:val="28"/>
-          <w:lang w:val="en-US"/>
-        </w:rPr>
-        <w:t>IP</w:t>
-      </w:r>
-      <w:r>
-        <w:rPr>
-          <w:rFonts w:ascii="Times New Roman" w:hAnsi="Times New Roman" w:cs="Times New Roman"/>
-          <w:bCs/>
-          <w:sz w:val="28"/>
-          <w:szCs w:val="28"/>
-        </w:rPr>
-        <w:t xml:space="preserve"> </w:t>
-      </w:r>
-      <w:r>
-        <w:rPr>
-          <w:rFonts w:ascii="Times New Roman" w:hAnsi="Times New Roman" w:cs="Times New Roman"/>
-          <w:bCs/>
-          <w:sz w:val="28"/>
-          <w:szCs w:val="28"/>
-        </w:rPr>
-        <w:t xml:space="preserve">адрес в отправляемой ссылке на тот, который принадлежит злоумышленнику, чтобы при нажатии на ссылку </w:t>
-      </w:r>
-      <w:r>
-        <w:rPr>
-          <w:rFonts w:ascii="Times New Roman" w:hAnsi="Times New Roman" w:cs="Times New Roman"/>
-          <w:bCs/>
-          <w:sz w:val="28"/>
-          <w:szCs w:val="28"/>
-          <w:lang w:val="en-US"/>
-        </w:rPr>
-        <w:t>Moniker</w:t>
-      </w:r>
-      <w:r>
-        <w:rPr>
-          <w:rFonts w:ascii="Times New Roman" w:hAnsi="Times New Roman" w:cs="Times New Roman"/>
-          <w:bCs/>
-          <w:sz w:val="28"/>
-          <w:szCs w:val="28"/>
-        </w:rPr>
-        <w:t xml:space="preserve"> </w:t>
-      </w:r>
-      <w:r>
-        <w:rPr>
-          <w:rFonts w:ascii="Times New Roman" w:hAnsi="Times New Roman" w:cs="Times New Roman"/>
-          <w:bCs/>
-          <w:sz w:val="28"/>
-          <w:szCs w:val="28"/>
-        </w:rPr>
-        <w:t xml:space="preserve">собирался именно с этого </w:t>
-      </w:r>
-      <w:r>
-        <w:rPr>
-          <w:rFonts w:ascii="Times New Roman" w:hAnsi="Times New Roman" w:cs="Times New Roman"/>
-          <w:bCs/>
-          <w:sz w:val="28"/>
-          <w:szCs w:val="28"/>
-          <w:lang w:val="en-US"/>
-        </w:rPr>
-        <w:t>IP</w:t>
-      </w:r>
-      <w:r>
-        <w:rPr>
-          <w:rFonts w:ascii="Times New Roman" w:hAnsi="Times New Roman" w:cs="Times New Roman"/>
-          <w:bCs/>
-          <w:sz w:val="28"/>
-          <w:szCs w:val="28"/>
-        </w:rPr>
-        <w:t xml:space="preserve"> </w:t>
-      </w:r>
-      <w:r>
-        <w:rPr>
-          <w:rFonts w:ascii="Times New Roman" w:hAnsi="Times New Roman" w:cs="Times New Roman"/>
-          <w:bCs/>
-          <w:sz w:val="28"/>
-          <w:szCs w:val="28"/>
-        </w:rPr>
-        <w:t>адреса.</w:t>
-      </w:r>
-    </w:p>
-    <w:p>
-      <w:pPr>
-        <w:pStyle w:val="af"/>
-        <w:spacing w:line="360" w:lineRule="auto"/>
         <w:jc w:val="center"/>
         <w:rPr>
           <w:rFonts w:ascii="Times New Roman" w:hAnsi="Times New Roman" w:cs="Times New Roman"/>
@@ -6993,13 +7037,12 @@
           <w:noProof/>
           <w:sz w:val="28"/>
           <w:szCs w:val="28"/>
-          <w:lang w:val="en-US"/>
         </w:rPr>
         <w:drawing>
-          <wp:inline distT="0" distB="0" distL="0" distR="0" wp14:anchorId="31CD7BE3" wp14:editId="33167541">
-            <wp:extent cx="5189670" cy="967824"/>
+          <wp:inline distT="0" distB="0" distL="0" distR="0" wp14:anchorId="0999D070" wp14:editId="6CDE10E2">
+            <wp:extent cx="4465707" cy="586791"/>
             <wp:effectExtent l="0" t="0" r="0" b="3810"/>
-            <wp:docPr id="38" name="Рисунок 38"/>
+            <wp:docPr id="39" name="Рисунок 39"/>
             <wp:cNvGraphicFramePr>
               <a:graphicFrameLocks xmlns:a="http://schemas.openxmlformats.org/drawingml/2006/main" noChangeAspect="1"/>
             </wp:cNvGraphicFramePr>
@@ -7019,7 +7062,7 @@
                   <pic:spPr>
                     <a:xfrm>
                       <a:off x="0" y="0"/>
-                      <a:ext cx="5189670" cy="967824"/>
+                      <a:ext cx="4465707" cy="586791"/>
                     </a:xfrm>
                     <a:prstGeom prst="rect">
                       <a:avLst/>
@@ -7051,7 +7094,7 @@
           <w:sz w:val="28"/>
           <w:szCs w:val="28"/>
         </w:rPr>
-        <w:t xml:space="preserve">Рисунок 8. </w:t>
+        <w:t xml:space="preserve">Рисунок 9. </w:t>
       </w:r>
       <w:r>
         <w:rPr>
@@ -7079,19 +7122,53 @@
           <w:sz w:val="28"/>
           <w:szCs w:val="28"/>
         </w:rPr>
-        <w:t>адрес злоумышленника</w:t>
+        <w:t xml:space="preserve">адрес сервера для </w:t>
+      </w:r>
+      <w:r>
+        <w:rPr>
+          <w:rFonts w:ascii="Times New Roman" w:hAnsi="Times New Roman" w:cs="Times New Roman"/>
+          <w:bCs/>
+          <w:sz w:val="28"/>
+          <w:szCs w:val="28"/>
+          <w:lang w:val="en-US"/>
+        </w:rPr>
+        <w:t>SMB</w:t>
       </w:r>
     </w:p>
     <w:p>
       <w:pPr>
         <w:pStyle w:val="af"/>
         <w:spacing w:line="360" w:lineRule="auto"/>
+        <w:ind w:firstLine="851"/>
+        <w:jc w:val="both"/>
+        <w:rPr>
+          <w:rFonts w:ascii="Times New Roman" w:hAnsi="Times New Roman" w:cs="Times New Roman"/>
+          <w:bCs/>
+          <w:sz w:val="28"/>
+          <w:szCs w:val="28"/>
+        </w:rPr>
+      </w:pPr>
+      <w:r>
+        <w:rPr>
+          <w:rFonts w:ascii="Times New Roman" w:hAnsi="Times New Roman" w:cs="Times New Roman"/>
+          <w:bCs/>
+          <w:sz w:val="28"/>
+          <w:szCs w:val="28"/>
+        </w:rPr>
+        <w:t>Запустим скрипт.</w:t>
+      </w:r>
+    </w:p>
+    <w:p>
+      <w:pPr>
+        <w:pStyle w:val="af"/>
+        <w:spacing w:line="360" w:lineRule="auto"/>
         <w:jc w:val="center"/>
         <w:rPr>
           <w:rFonts w:ascii="Times New Roman" w:hAnsi="Times New Roman" w:cs="Times New Roman"/>
           <w:bCs/>
           <w:sz w:val="28"/>
           <w:szCs w:val="28"/>
+          <w:lang w:val="en-US"/>
         </w:rPr>
       </w:pPr>
       <w:r>
@@ -7101,12 +7178,13 @@
           <w:noProof/>
           <w:sz w:val="28"/>
           <w:szCs w:val="28"/>
+          <w:lang w:val="en-US"/>
         </w:rPr>
         <w:drawing>
-          <wp:inline distT="0" distB="0" distL="0" distR="0" wp14:anchorId="0999D070" wp14:editId="6CDE10E2">
-            <wp:extent cx="4465707" cy="586791"/>
-            <wp:effectExtent l="0" t="0" r="0" b="3810"/>
-            <wp:docPr id="39" name="Рисунок 39"/>
+          <wp:inline distT="0" distB="0" distL="0" distR="0" wp14:anchorId="5A2C6D11" wp14:editId="7560FC2A">
+            <wp:extent cx="4968671" cy="1912786"/>
+            <wp:effectExtent l="0" t="0" r="3810" b="0"/>
+            <wp:docPr id="40" name="Рисунок 40"/>
             <wp:cNvGraphicFramePr>
               <a:graphicFrameLocks xmlns:a="http://schemas.openxmlformats.org/drawingml/2006/main" noChangeAspect="1"/>
             </wp:cNvGraphicFramePr>
@@ -7126,7 +7204,7 @@
                   <pic:spPr>
                     <a:xfrm>
                       <a:off x="0" y="0"/>
-                      <a:ext cx="4465707" cy="586791"/>
+                      <a:ext cx="4968671" cy="1912786"/>
                     </a:xfrm>
                     <a:prstGeom prst="rect">
                       <a:avLst/>
@@ -7158,81 +7236,19 @@
           <w:sz w:val="28"/>
           <w:szCs w:val="28"/>
         </w:rPr>
-        <w:t xml:space="preserve">Рисунок 9. </w:t>
-      </w:r>
-      <w:r>
-        <w:rPr>
-          <w:rFonts w:ascii="Times New Roman" w:hAnsi="Times New Roman" w:cs="Times New Roman"/>
-          <w:bCs/>
-          <w:sz w:val="28"/>
-          <w:szCs w:val="28"/>
-          <w:lang w:val="en-US"/>
-        </w:rPr>
-        <w:t>IP</w:t>
-      </w:r>
-      <w:r>
-        <w:rPr>
-          <w:rFonts w:ascii="Times New Roman" w:hAnsi="Times New Roman" w:cs="Times New Roman"/>
-          <w:bCs/>
-          <w:sz w:val="28"/>
-          <w:szCs w:val="28"/>
-        </w:rPr>
-        <w:t xml:space="preserve"> </w:t>
-      </w:r>
-      <w:r>
-        <w:rPr>
-          <w:rFonts w:ascii="Times New Roman" w:hAnsi="Times New Roman" w:cs="Times New Roman"/>
-          <w:bCs/>
-          <w:sz w:val="28"/>
-          <w:szCs w:val="28"/>
-        </w:rPr>
-        <w:t xml:space="preserve">адрес сервера для </w:t>
-      </w:r>
-      <w:r>
-        <w:rPr>
-          <w:rFonts w:ascii="Times New Roman" w:hAnsi="Times New Roman" w:cs="Times New Roman"/>
-          <w:bCs/>
-          <w:sz w:val="28"/>
-          <w:szCs w:val="28"/>
-          <w:lang w:val="en-US"/>
-        </w:rPr>
-        <w:t>SMB</w:t>
+        <w:t>Рисунок 10. Успешная отправка письма</w:t>
       </w:r>
     </w:p>
     <w:p>
       <w:pPr>
         <w:pStyle w:val="af"/>
         <w:spacing w:line="360" w:lineRule="auto"/>
-        <w:ind w:firstLine="851"/>
-        <w:jc w:val="both"/>
-        <w:rPr>
-          <w:rFonts w:ascii="Times New Roman" w:hAnsi="Times New Roman" w:cs="Times New Roman"/>
-          <w:bCs/>
-          <w:sz w:val="28"/>
-          <w:szCs w:val="28"/>
-        </w:rPr>
-      </w:pPr>
-      <w:r>
-        <w:rPr>
-          <w:rFonts w:ascii="Times New Roman" w:hAnsi="Times New Roman" w:cs="Times New Roman"/>
-          <w:bCs/>
-          <w:sz w:val="28"/>
-          <w:szCs w:val="28"/>
-        </w:rPr>
-        <w:t>Запустим скрипт.</w:t>
-      </w:r>
-    </w:p>
-    <w:p>
-      <w:pPr>
-        <w:pStyle w:val="af"/>
-        <w:spacing w:line="360" w:lineRule="auto"/>
         <w:jc w:val="center"/>
         <w:rPr>
           <w:rFonts w:ascii="Times New Roman" w:hAnsi="Times New Roman" w:cs="Times New Roman"/>
           <w:bCs/>
           <w:sz w:val="28"/>
           <w:szCs w:val="28"/>
-          <w:lang w:val="en-US"/>
         </w:rPr>
       </w:pPr>
       <w:r>
@@ -7242,13 +7258,12 @@
           <w:noProof/>
           <w:sz w:val="28"/>
           <w:szCs w:val="28"/>
-          <w:lang w:val="en-US"/>
         </w:rPr>
         <w:drawing>
-          <wp:inline distT="0" distB="0" distL="0" distR="0" wp14:anchorId="5A2C6D11" wp14:editId="7560FC2A">
-            <wp:extent cx="4968671" cy="1912786"/>
-            <wp:effectExtent l="0" t="0" r="3810" b="0"/>
-            <wp:docPr id="40" name="Рисунок 40"/>
+          <wp:inline distT="0" distB="0" distL="0" distR="0" wp14:anchorId="4E6D897E" wp14:editId="5B407D17">
+            <wp:extent cx="2972058" cy="2705334"/>
+            <wp:effectExtent l="0" t="0" r="0" b="0"/>
+            <wp:docPr id="41" name="Рисунок 41"/>
             <wp:cNvGraphicFramePr>
               <a:graphicFrameLocks xmlns:a="http://schemas.openxmlformats.org/drawingml/2006/main" noChangeAspect="1"/>
             </wp:cNvGraphicFramePr>
@@ -7268,7 +7283,7 @@
                   <pic:spPr>
                     <a:xfrm>
                       <a:off x="0" y="0"/>
-                      <a:ext cx="4968671" cy="1912786"/>
+                      <a:ext cx="2972058" cy="2705334"/>
                     </a:xfrm>
                     <a:prstGeom prst="rect">
                       <a:avLst/>
@@ -7300,13 +7315,96 @@
           <w:sz w:val="28"/>
           <w:szCs w:val="28"/>
         </w:rPr>
-        <w:t>Рисунок 10. Успешная отправка письма</w:t>
+        <w:t>Рисунок 11. Получение письма</w:t>
       </w:r>
     </w:p>
     <w:p>
       <w:pPr>
         <w:pStyle w:val="af"/>
         <w:spacing w:line="360" w:lineRule="auto"/>
+        <w:ind w:firstLine="851"/>
+        <w:jc w:val="both"/>
+        <w:rPr>
+          <w:rFonts w:ascii="Times New Roman" w:hAnsi="Times New Roman" w:cs="Times New Roman"/>
+          <w:bCs/>
+          <w:sz w:val="28"/>
+          <w:szCs w:val="28"/>
+        </w:rPr>
+      </w:pPr>
+      <w:r>
+        <w:rPr>
+          <w:rFonts w:ascii="Times New Roman" w:hAnsi="Times New Roman" w:cs="Times New Roman"/>
+          <w:bCs/>
+          <w:sz w:val="28"/>
+          <w:szCs w:val="28"/>
+        </w:rPr>
+        <w:lastRenderedPageBreak/>
+        <w:t>П</w:t>
+      </w:r>
+      <w:r>
+        <w:rPr>
+          <w:rFonts w:ascii="Times New Roman" w:hAnsi="Times New Roman" w:cs="Times New Roman"/>
+          <w:bCs/>
+          <w:sz w:val="28"/>
+          <w:szCs w:val="28"/>
+        </w:rPr>
+        <w:t xml:space="preserve">ри обработке такой ссылки операционная система выполняет попытку подключения к удаленному SMB-ресурсу (порт 445). При этом автоматически </w:t>
+      </w:r>
+      <w:r>
+        <w:rPr>
+          <w:rFonts w:ascii="Times New Roman" w:hAnsi="Times New Roman" w:cs="Times New Roman"/>
+          <w:bCs/>
+          <w:sz w:val="28"/>
+          <w:szCs w:val="28"/>
+        </w:rPr>
+        <w:t xml:space="preserve">передается </w:t>
+      </w:r>
+      <w:r>
+        <w:rPr>
+          <w:rFonts w:ascii="Times New Roman" w:hAnsi="Times New Roman" w:cs="Times New Roman"/>
+          <w:bCs/>
+          <w:sz w:val="28"/>
+          <w:szCs w:val="28"/>
+          <w:lang w:val="en-US"/>
+        </w:rPr>
+        <w:t>NTLM</w:t>
+      </w:r>
+      <w:r>
+        <w:rPr>
+          <w:rFonts w:ascii="Times New Roman" w:hAnsi="Times New Roman" w:cs="Times New Roman"/>
+          <w:bCs/>
+          <w:sz w:val="28"/>
+          <w:szCs w:val="28"/>
+        </w:rPr>
+        <w:t xml:space="preserve"> </w:t>
+      </w:r>
+      <w:r>
+        <w:rPr>
+          <w:rFonts w:ascii="Times New Roman" w:hAnsi="Times New Roman" w:cs="Times New Roman"/>
+          <w:bCs/>
+          <w:sz w:val="28"/>
+          <w:szCs w:val="28"/>
+        </w:rPr>
+        <w:t>– хэш, для аутентификации пользователя, который получает злоумышленник.</w:t>
+      </w:r>
+    </w:p>
+    <w:p>
+      <w:pPr>
+        <w:pStyle w:val="af"/>
+        <w:spacing w:line="360" w:lineRule="auto"/>
+        <w:jc w:val="both"/>
+        <w:rPr>
+          <w:rFonts w:ascii="Times New Roman" w:hAnsi="Times New Roman" w:cs="Times New Roman"/>
+          <w:bCs/>
+          <w:sz w:val="28"/>
+          <w:szCs w:val="28"/>
+        </w:rPr>
+      </w:pPr>
+    </w:p>
+    <w:p>
+      <w:pPr>
+        <w:pStyle w:val="af"/>
+        <w:spacing w:line="360" w:lineRule="auto"/>
         <w:jc w:val="center"/>
         <w:rPr>
           <w:rFonts w:ascii="Times New Roman" w:hAnsi="Times New Roman" w:cs="Times New Roman"/>
@@ -7324,10 +7422,10 @@
           <w:szCs w:val="28"/>
         </w:rPr>
         <w:drawing>
-          <wp:inline distT="0" distB="0" distL="0" distR="0" wp14:anchorId="4E6D897E" wp14:editId="5B407D17">
-            <wp:extent cx="2972058" cy="2705334"/>
-            <wp:effectExtent l="0" t="0" r="0" b="0"/>
-            <wp:docPr id="41" name="Рисунок 41"/>
+          <wp:inline distT="0" distB="0" distL="0" distR="0" wp14:anchorId="7F6EAA48" wp14:editId="538787DD">
+            <wp:extent cx="5616427" cy="2286198"/>
+            <wp:effectExtent l="0" t="0" r="3810" b="0"/>
+            <wp:docPr id="42" name="Рисунок 42"/>
             <wp:cNvGraphicFramePr>
               <a:graphicFrameLocks xmlns:a="http://schemas.openxmlformats.org/drawingml/2006/main" noChangeAspect="1"/>
             </wp:cNvGraphicFramePr>
@@ -7347,7 +7445,7 @@
                   <pic:spPr>
                     <a:xfrm>
                       <a:off x="0" y="0"/>
-                      <a:ext cx="2972058" cy="2705334"/>
+                      <a:ext cx="5616427" cy="2286198"/>
                     </a:xfrm>
                     <a:prstGeom prst="rect">
                       <a:avLst/>
@@ -7379,102 +7477,20 @@
           <w:sz w:val="28"/>
           <w:szCs w:val="28"/>
         </w:rPr>
-        <w:t>Рисунок 11. Получение письма</w:t>
+        <w:t>Рисунок 12. Итог нажатия на гиперссылку</w:t>
       </w:r>
     </w:p>
     <w:p>
       <w:pPr>
         <w:pStyle w:val="af"/>
         <w:spacing w:line="360" w:lineRule="auto"/>
-        <w:ind w:firstLine="851"/>
-        <w:jc w:val="both"/>
-        <w:rPr>
-          <w:rFonts w:ascii="Times New Roman" w:hAnsi="Times New Roman" w:cs="Times New Roman"/>
-          <w:bCs/>
-          <w:sz w:val="28"/>
-          <w:szCs w:val="28"/>
-        </w:rPr>
-      </w:pPr>
-      <w:r>
-        <w:rPr>
-          <w:rFonts w:ascii="Times New Roman" w:hAnsi="Times New Roman" w:cs="Times New Roman"/>
-          <w:bCs/>
-          <w:sz w:val="28"/>
-          <w:szCs w:val="28"/>
-        </w:rPr>
-        <w:lastRenderedPageBreak/>
-        <w:t>П</w:t>
-      </w:r>
-      <w:r>
-        <w:rPr>
-          <w:rFonts w:ascii="Times New Roman" w:hAnsi="Times New Roman" w:cs="Times New Roman"/>
-          <w:bCs/>
-          <w:sz w:val="28"/>
-          <w:szCs w:val="28"/>
-        </w:rPr>
-        <w:t xml:space="preserve">ри обработке такой ссылки операционная система выполняет попытку подключения к удаленному SMB-ресурсу (порт 445). При этом автоматически </w:t>
-      </w:r>
-      <w:r>
-        <w:rPr>
-          <w:rFonts w:ascii="Times New Roman" w:hAnsi="Times New Roman" w:cs="Times New Roman"/>
-          <w:bCs/>
-          <w:sz w:val="28"/>
-          <w:szCs w:val="28"/>
-        </w:rPr>
-        <w:t xml:space="preserve">передается </w:t>
-      </w:r>
-      <w:r>
-        <w:rPr>
-          <w:rFonts w:ascii="Times New Roman" w:hAnsi="Times New Roman" w:cs="Times New Roman"/>
-          <w:bCs/>
-          <w:sz w:val="28"/>
-          <w:szCs w:val="28"/>
-          <w:lang w:val="en-US"/>
-        </w:rPr>
-        <w:t>NTLM</w:t>
-      </w:r>
-      <w:r>
-        <w:rPr>
-          <w:rFonts w:ascii="Times New Roman" w:hAnsi="Times New Roman" w:cs="Times New Roman"/>
-          <w:bCs/>
-          <w:sz w:val="28"/>
-          <w:szCs w:val="28"/>
-        </w:rPr>
-        <w:t xml:space="preserve"> </w:t>
-      </w:r>
-      <w:r>
-        <w:rPr>
-          <w:rFonts w:ascii="Times New Roman" w:hAnsi="Times New Roman" w:cs="Times New Roman"/>
-          <w:bCs/>
-          <w:sz w:val="28"/>
-          <w:szCs w:val="28"/>
-        </w:rPr>
-        <w:t>– хэш, для аутентификации пользователя, который получает злоумышленник.</w:t>
-      </w:r>
-    </w:p>
-    <w:p>
-      <w:pPr>
-        <w:pStyle w:val="af"/>
-        <w:spacing w:line="360" w:lineRule="auto"/>
-        <w:jc w:val="both"/>
-        <w:rPr>
-          <w:rFonts w:ascii="Times New Roman" w:hAnsi="Times New Roman" w:cs="Times New Roman"/>
-          <w:bCs/>
-          <w:sz w:val="28"/>
-          <w:szCs w:val="28"/>
-        </w:rPr>
-      </w:pPr>
-    </w:p>
-    <w:p>
-      <w:pPr>
-        <w:pStyle w:val="af"/>
-        <w:spacing w:line="360" w:lineRule="auto"/>
         <w:jc w:val="center"/>
         <w:rPr>
           <w:rFonts w:ascii="Times New Roman" w:hAnsi="Times New Roman" w:cs="Times New Roman"/>
           <w:bCs/>
           <w:sz w:val="28"/>
           <w:szCs w:val="28"/>
+          <w:lang w:val="en-US"/>
         </w:rPr>
       </w:pPr>
       <w:r>
@@ -7484,12 +7500,13 @@
           <w:noProof/>
           <w:sz w:val="28"/>
           <w:szCs w:val="28"/>
+          <w:lang w:val="en-US"/>
         </w:rPr>
         <w:drawing>
-          <wp:inline distT="0" distB="0" distL="0" distR="0" wp14:anchorId="7F6EAA48" wp14:editId="538787DD">
-            <wp:extent cx="5616427" cy="2286198"/>
-            <wp:effectExtent l="0" t="0" r="3810" b="0"/>
-            <wp:docPr id="42" name="Рисунок 42"/>
+          <wp:inline distT="0" distB="0" distL="0" distR="0" wp14:anchorId="370CEB5B" wp14:editId="5B8D2075">
+            <wp:extent cx="6122670" cy="2748915"/>
+            <wp:effectExtent l="0" t="0" r="0" b="0"/>
+            <wp:docPr id="43" name="Рисунок 43"/>
             <wp:cNvGraphicFramePr>
               <a:graphicFrameLocks xmlns:a="http://schemas.openxmlformats.org/drawingml/2006/main" noChangeAspect="1"/>
             </wp:cNvGraphicFramePr>
@@ -7509,7 +7526,7 @@
                   <pic:spPr>
                     <a:xfrm>
                       <a:off x="0" y="0"/>
-                      <a:ext cx="5616427" cy="2286198"/>
+                      <a:ext cx="6122670" cy="2748915"/>
                     </a:xfrm>
                     <a:prstGeom prst="rect">
                       <a:avLst/>
@@ -7541,36 +7558,188 @@
           <w:sz w:val="28"/>
           <w:szCs w:val="28"/>
         </w:rPr>
-        <w:t>Рисунок 12. Итог нажатия на гиперссылку</w:t>
+        <w:t xml:space="preserve">Рисунок 13. Результат </w:t>
+      </w:r>
+      <w:r>
+        <w:rPr>
+          <w:rFonts w:ascii="Times New Roman" w:hAnsi="Times New Roman" w:cs="Times New Roman"/>
+          <w:bCs/>
+          <w:sz w:val="28"/>
+          <w:szCs w:val="28"/>
+          <w:lang w:val="en-US"/>
+        </w:rPr>
+        <w:t>responder</w:t>
       </w:r>
     </w:p>
     <w:p>
       <w:pPr>
         <w:pStyle w:val="af"/>
         <w:spacing w:line="360" w:lineRule="auto"/>
-        <w:jc w:val="center"/>
-        <w:rPr>
-          <w:rFonts w:ascii="Times New Roman" w:hAnsi="Times New Roman" w:cs="Times New Roman"/>
-          <w:bCs/>
-          <w:sz w:val="28"/>
-          <w:szCs w:val="28"/>
-          <w:lang w:val="en-US"/>
-        </w:rPr>
-      </w:pPr>
-      <w:r>
-        <w:rPr>
-          <w:rFonts w:ascii="Times New Roman" w:hAnsi="Times New Roman" w:cs="Times New Roman"/>
-          <w:bCs/>
+        <w:ind w:firstLine="851"/>
+        <w:jc w:val="both"/>
+        <w:rPr>
+          <w:rFonts w:ascii="Times New Roman" w:hAnsi="Times New Roman" w:cs="Times New Roman"/>
+          <w:bCs/>
+          <w:sz w:val="28"/>
+          <w:szCs w:val="28"/>
+        </w:rPr>
+      </w:pPr>
+      <w:r>
+        <w:rPr>
+          <w:rFonts w:ascii="Times New Roman" w:hAnsi="Times New Roman" w:cs="Times New Roman"/>
+          <w:bCs/>
+          <w:sz w:val="28"/>
+          <w:szCs w:val="28"/>
+        </w:rPr>
+        <w:t xml:space="preserve">В результате обработки Moniker-ссылки операционная система инициировала SMB-подключение к удаленному серверу. Инструмент </w:t>
+      </w:r>
+      <w:proofErr w:type="spellStart"/>
+      <w:r>
+        <w:rPr>
+          <w:rFonts w:ascii="Times New Roman" w:hAnsi="Times New Roman" w:cs="Times New Roman"/>
+          <w:bCs/>
+          <w:sz w:val="28"/>
+          <w:szCs w:val="28"/>
+        </w:rPr>
+        <w:t>Responder</w:t>
+      </w:r>
+      <w:proofErr w:type="spellEnd"/>
+      <w:r>
+        <w:rPr>
+          <w:rFonts w:ascii="Times New Roman" w:hAnsi="Times New Roman" w:cs="Times New Roman"/>
+          <w:bCs/>
+          <w:sz w:val="28"/>
+          <w:szCs w:val="28"/>
+        </w:rPr>
+        <w:t xml:space="preserve"> успешно перехватил NTLMv2-аутентификационные данные пользователя THM-MONIKERLINK\</w:t>
+      </w:r>
+      <w:proofErr w:type="spellStart"/>
+      <w:r>
+        <w:rPr>
+          <w:rFonts w:ascii="Times New Roman" w:hAnsi="Times New Roman" w:cs="Times New Roman"/>
+          <w:bCs/>
+          <w:sz w:val="28"/>
+          <w:szCs w:val="28"/>
+        </w:rPr>
+        <w:t>tryhackme</w:t>
+      </w:r>
+      <w:proofErr w:type="spellEnd"/>
+      <w:r>
+        <w:rPr>
+          <w:rFonts w:ascii="Times New Roman" w:hAnsi="Times New Roman" w:cs="Times New Roman"/>
+          <w:bCs/>
+          <w:sz w:val="28"/>
+          <w:szCs w:val="28"/>
+        </w:rPr>
+        <w:t>, что подтверждает возможность получения учетных данных при эксплуатации CVE-2024-21413.</w:t>
+      </w:r>
+    </w:p>
+    <w:p>
+      <w:pPr>
+        <w:pStyle w:val="af"/>
+        <w:spacing w:line="360" w:lineRule="auto"/>
+        <w:jc w:val="both"/>
+        <w:rPr>
+          <w:rFonts w:ascii="Times New Roman" w:hAnsi="Times New Roman" w:cs="Times New Roman"/>
+          <w:bCs/>
+          <w:sz w:val="28"/>
+          <w:szCs w:val="28"/>
+        </w:rPr>
+      </w:pPr>
+    </w:p>
+    <w:p>
+      <w:pPr>
+        <w:pStyle w:val="af"/>
+        <w:spacing w:line="360" w:lineRule="auto"/>
+        <w:ind w:firstLine="709"/>
+        <w:jc w:val="both"/>
+        <w:rPr>
+          <w:rFonts w:ascii="Times New Roman" w:hAnsi="Times New Roman" w:cs="Times New Roman"/>
+          <w:b/>
+          <w:sz w:val="32"/>
+          <w:szCs w:val="28"/>
+        </w:rPr>
+      </w:pPr>
+      <w:r>
+        <w:rPr>
+          <w:rFonts w:ascii="Times New Roman" w:hAnsi="Times New Roman" w:cs="Times New Roman"/>
+          <w:b/>
+          <w:sz w:val="32"/>
+          <w:szCs w:val="28"/>
+        </w:rPr>
+        <w:lastRenderedPageBreak/>
+        <w:t>2.4. Исследование процесса обработки ссылки</w:t>
+      </w:r>
+    </w:p>
+    <w:p>
+      <w:pPr>
+        <w:pStyle w:val="af"/>
+        <w:spacing w:line="360" w:lineRule="auto"/>
+        <w:ind w:firstLine="851"/>
+        <w:jc w:val="both"/>
+        <w:rPr>
+          <w:rFonts w:ascii="Times New Roman" w:hAnsi="Times New Roman" w:cs="Times New Roman"/>
+          <w:sz w:val="28"/>
+          <w:szCs w:val="28"/>
+        </w:rPr>
+      </w:pPr>
+      <w:r>
+        <w:rPr>
+          <w:rFonts w:ascii="Times New Roman" w:hAnsi="Times New Roman" w:cs="Times New Roman"/>
+          <w:sz w:val="28"/>
+          <w:szCs w:val="28"/>
+        </w:rPr>
+        <w:t xml:space="preserve">Для исследования процесса обработки гиперссылки в </w:t>
+      </w:r>
+      <w:proofErr w:type="spellStart"/>
+      <w:r>
+        <w:rPr>
+          <w:rFonts w:ascii="Times New Roman" w:hAnsi="Times New Roman" w:cs="Times New Roman"/>
+          <w:sz w:val="28"/>
+          <w:szCs w:val="28"/>
+        </w:rPr>
+        <w:t>WinDbg</w:t>
+      </w:r>
+      <w:proofErr w:type="spellEnd"/>
+      <w:r>
+        <w:rPr>
+          <w:rFonts w:ascii="Times New Roman" w:hAnsi="Times New Roman" w:cs="Times New Roman"/>
+          <w:sz w:val="28"/>
+          <w:szCs w:val="28"/>
+        </w:rPr>
+        <w:t xml:space="preserve"> была установлена точка останова на функции </w:t>
+      </w:r>
+      <w:proofErr w:type="spellStart"/>
+      <w:r>
+        <w:rPr>
+          <w:rFonts w:ascii="Times New Roman" w:hAnsi="Times New Roman" w:cs="Times New Roman"/>
+          <w:sz w:val="28"/>
+          <w:szCs w:val="28"/>
+        </w:rPr>
+        <w:t>MkParseDisplayName</w:t>
+      </w:r>
+      <w:proofErr w:type="spellEnd"/>
+      <w:r>
+        <w:rPr>
+          <w:rFonts w:ascii="Times New Roman" w:hAnsi="Times New Roman" w:cs="Times New Roman"/>
+          <w:sz w:val="28"/>
+          <w:szCs w:val="28"/>
+        </w:rPr>
+        <w:t>. После перехода по ссылке выполнение программы было остановлено в момент вызова данной функции, что позволило исследовать стек вызовов и передаваемые параметры.</w:t>
+      </w:r>
+      <w:r>
+        <w:rPr>
+          <w:rFonts w:ascii="Times New Roman" w:hAnsi="Times New Roman" w:cs="Times New Roman"/>
           <w:noProof/>
           <w:sz w:val="28"/>
           <w:szCs w:val="28"/>
           <w:lang w:val="en-US"/>
         </w:rPr>
         <w:drawing>
-          <wp:inline distT="0" distB="0" distL="0" distR="0" wp14:anchorId="370CEB5B" wp14:editId="5B8D2075">
-            <wp:extent cx="6122670" cy="2748915"/>
+          <wp:inline distT="0" distB="0" distL="0" distR="0" wp14:anchorId="2A8CE9A5" wp14:editId="5147E5C6">
+            <wp:extent cx="6122670" cy="3525520"/>
             <wp:effectExtent l="0" t="0" r="0" b="0"/>
-            <wp:docPr id="43" name="Рисунок 43"/>
+            <wp:docPr id="31" name="Рисунок 31"/>
             <wp:cNvGraphicFramePr>
               <a:graphicFrameLocks xmlns:a="http://schemas.openxmlformats.org/drawingml/2006/main" noChangeAspect="1"/>
             </wp:cNvGraphicFramePr>
@@ -7590,7 +7759,7 @@
                   <pic:spPr>
                     <a:xfrm>
                       <a:off x="0" y="0"/>
-                      <a:ext cx="6122670" cy="2748915"/>
+                      <a:ext cx="6122670" cy="3525520"/>
                     </a:xfrm>
                     <a:prstGeom prst="rect">
                       <a:avLst/>
@@ -7610,29 +7779,33 @@
         <w:jc w:val="center"/>
         <w:rPr>
           <w:rFonts w:ascii="Times New Roman" w:hAnsi="Times New Roman" w:cs="Times New Roman"/>
-          <w:bCs/>
-          <w:sz w:val="28"/>
-          <w:szCs w:val="28"/>
-        </w:rPr>
-      </w:pPr>
-      <w:r>
-        <w:rPr>
-          <w:rFonts w:ascii="Times New Roman" w:hAnsi="Times New Roman" w:cs="Times New Roman"/>
-          <w:bCs/>
-          <w:sz w:val="28"/>
-          <w:szCs w:val="28"/>
-        </w:rPr>
-        <w:t xml:space="preserve">Рисунок 13. Результат </w:t>
-      </w:r>
-      <w:r>
-        <w:rPr>
-          <w:rFonts w:ascii="Times New Roman" w:hAnsi="Times New Roman" w:cs="Times New Roman"/>
-          <w:bCs/>
-          <w:sz w:val="28"/>
-          <w:szCs w:val="28"/>
-          <w:lang w:val="en-US"/>
-        </w:rPr>
-        <w:t>responder</w:t>
+          <w:sz w:val="28"/>
+          <w:szCs w:val="28"/>
+        </w:rPr>
+      </w:pPr>
+      <w:r>
+        <w:rPr>
+          <w:rFonts w:ascii="Times New Roman" w:hAnsi="Times New Roman" w:cs="Times New Roman"/>
+          <w:sz w:val="28"/>
+          <w:szCs w:val="28"/>
+        </w:rPr>
+        <w:t xml:space="preserve">Рисунок </w:t>
+      </w:r>
+      <w:r>
+        <w:rPr>
+          <w:rFonts w:ascii="Times New Roman" w:hAnsi="Times New Roman" w:cs="Times New Roman"/>
+          <w:sz w:val="28"/>
+          <w:szCs w:val="28"/>
+        </w:rPr>
+        <w:t>14</w:t>
+      </w:r>
+      <w:r>
+        <w:rPr>
+          <w:rFonts w:ascii="Times New Roman" w:hAnsi="Times New Roman" w:cs="Times New Roman"/>
+          <w:sz w:val="28"/>
+          <w:szCs w:val="28"/>
+        </w:rPr>
+        <w:t>. Стек вызовов</w:t>
       </w:r>
     </w:p>
     <w:p>
@@ -7643,59 +7816,53 @@
         <w:jc w:val="both"/>
         <w:rPr>
           <w:rFonts w:ascii="Times New Roman" w:hAnsi="Times New Roman" w:cs="Times New Roman"/>
-          <w:bCs/>
-          <w:sz w:val="28"/>
-          <w:szCs w:val="28"/>
-        </w:rPr>
-      </w:pPr>
-      <w:r>
-        <w:rPr>
-          <w:rFonts w:ascii="Times New Roman" w:hAnsi="Times New Roman" w:cs="Times New Roman"/>
-          <w:bCs/>
-          <w:sz w:val="28"/>
-          <w:szCs w:val="28"/>
-        </w:rPr>
-        <w:t xml:space="preserve">В результате обработки Moniker-ссылки операционная система инициировала SMB-подключение к удаленному серверу. Инструмент </w:t>
+          <w:sz w:val="28"/>
+          <w:szCs w:val="28"/>
+        </w:rPr>
+      </w:pPr>
+      <w:r>
+        <w:rPr>
+          <w:rFonts w:ascii="Times New Roman" w:hAnsi="Times New Roman" w:cs="Times New Roman"/>
+          <w:sz w:val="28"/>
+          <w:szCs w:val="28"/>
+        </w:rPr>
+        <w:t xml:space="preserve">Согласно документации Microsoft, вторым параметром функции </w:t>
       </w:r>
       <w:proofErr w:type="spellStart"/>
       <w:r>
         <w:rPr>
           <w:rFonts w:ascii="Times New Roman" w:hAnsi="Times New Roman" w:cs="Times New Roman"/>
-          <w:bCs/>
-          <w:sz w:val="28"/>
-          <w:szCs w:val="28"/>
-        </w:rPr>
-        <w:t>Responder</w:t>
+          <w:sz w:val="28"/>
+          <w:szCs w:val="28"/>
+        </w:rPr>
+        <w:t>MkParseDisplayName</w:t>
       </w:r>
       <w:proofErr w:type="spellEnd"/>
       <w:r>
         <w:rPr>
           <w:rFonts w:ascii="Times New Roman" w:hAnsi="Times New Roman" w:cs="Times New Roman"/>
-          <w:bCs/>
-          <w:sz w:val="28"/>
-          <w:szCs w:val="28"/>
-        </w:rPr>
-        <w:t xml:space="preserve"> успешно перехватил NTLMv2-аутентификационные данные пользователя THM-MONIKERLINK\</w:t>
+          <w:sz w:val="28"/>
+          <w:szCs w:val="28"/>
+        </w:rPr>
+        <w:t xml:space="preserve"> является </w:t>
       </w:r>
       <w:proofErr w:type="spellStart"/>
       <w:r>
         <w:rPr>
           <w:rFonts w:ascii="Times New Roman" w:hAnsi="Times New Roman" w:cs="Times New Roman"/>
-          <w:bCs/>
-          <w:sz w:val="28"/>
-          <w:szCs w:val="28"/>
-        </w:rPr>
-        <w:t>tryhackme</w:t>
+          <w:sz w:val="28"/>
+          <w:szCs w:val="28"/>
+        </w:rPr>
+        <w:t>szUserName</w:t>
       </w:r>
       <w:proofErr w:type="spellEnd"/>
       <w:r>
         <w:rPr>
           <w:rFonts w:ascii="Times New Roman" w:hAnsi="Times New Roman" w:cs="Times New Roman"/>
-          <w:bCs/>
-          <w:sz w:val="28"/>
-          <w:szCs w:val="28"/>
-        </w:rPr>
-        <w:t>, что подтверждает возможность получения учетных данных при эксплуатации CVE-2024-21413.</w:t>
+          <w:sz w:val="28"/>
+          <w:szCs w:val="28"/>
+        </w:rPr>
+        <w:t xml:space="preserve"> — строковое представление объекта, подлежащего разрешению в COM Moniker. Анализ содержимого параметра показал, что в функцию передается путь к удаленному ресурсу без префикса file:///, что подтверждает передачу строки в механизм обработки Moniker.</w:t>
       </w:r>
     </w:p>
     <w:p>
@@ -7705,7 +7872,6 @@
         <w:jc w:val="both"/>
         <w:rPr>
           <w:rFonts w:ascii="Times New Roman" w:hAnsi="Times New Roman" w:cs="Times New Roman"/>
-          <w:bCs/>
           <w:sz w:val="28"/>
           <w:szCs w:val="28"/>
         </w:rPr>
@@ -7715,95 +7881,25 @@
       <w:pPr>
         <w:pStyle w:val="af"/>
         <w:spacing w:line="360" w:lineRule="auto"/>
-        <w:ind w:firstLine="709"/>
-        <w:jc w:val="both"/>
-        <w:rPr>
-          <w:rFonts w:ascii="Times New Roman" w:hAnsi="Times New Roman" w:cs="Times New Roman"/>
-          <w:b/>
-          <w:sz w:val="32"/>
-          <w:szCs w:val="28"/>
-        </w:rPr>
-      </w:pPr>
-      <w:r>
-        <w:rPr>
-          <w:rFonts w:ascii="Times New Roman" w:hAnsi="Times New Roman" w:cs="Times New Roman"/>
-          <w:b/>
-          <w:sz w:val="32"/>
-          <w:szCs w:val="28"/>
-        </w:rPr>
-        <w:lastRenderedPageBreak/>
-        <w:t>2.4. Исследование процесса обработки ссылки</w:t>
-      </w:r>
-    </w:p>
-    <w:p>
-      <w:pPr>
-        <w:pStyle w:val="af"/>
-        <w:spacing w:line="360" w:lineRule="auto"/>
-        <w:ind w:firstLine="851"/>
-        <w:jc w:val="both"/>
-        <w:rPr>
-          <w:rFonts w:ascii="Times New Roman" w:hAnsi="Times New Roman" w:cs="Times New Roman"/>
-          <w:sz w:val="28"/>
-          <w:szCs w:val="28"/>
-        </w:rPr>
-      </w:pPr>
-      <w:r>
-        <w:rPr>
-          <w:rFonts w:ascii="Times New Roman" w:hAnsi="Times New Roman" w:cs="Times New Roman"/>
-          <w:sz w:val="28"/>
-          <w:szCs w:val="28"/>
-        </w:rPr>
-        <w:t xml:space="preserve">Для исследования процесса обработки гиперссылки в </w:t>
-      </w:r>
-      <w:proofErr w:type="spellStart"/>
-      <w:r>
-        <w:rPr>
-          <w:rFonts w:ascii="Times New Roman" w:hAnsi="Times New Roman" w:cs="Times New Roman"/>
-          <w:sz w:val="28"/>
-          <w:szCs w:val="28"/>
-        </w:rPr>
-        <w:t>WinDbg</w:t>
-      </w:r>
-      <w:proofErr w:type="spellEnd"/>
-      <w:r>
-        <w:rPr>
-          <w:rFonts w:ascii="Times New Roman" w:hAnsi="Times New Roman" w:cs="Times New Roman"/>
-          <w:sz w:val="28"/>
-          <w:szCs w:val="28"/>
-        </w:rPr>
-        <w:t xml:space="preserve"> была установлена точка останова на функции </w:t>
-      </w:r>
-      <w:proofErr w:type="spellStart"/>
-      <w:r>
-        <w:rPr>
-          <w:rFonts w:ascii="Times New Roman" w:hAnsi="Times New Roman" w:cs="Times New Roman"/>
-          <w:sz w:val="28"/>
-          <w:szCs w:val="28"/>
-        </w:rPr>
-        <w:t>MkParseDisplayName</w:t>
-      </w:r>
-      <w:proofErr w:type="spellEnd"/>
-      <w:r>
-        <w:rPr>
-          <w:rFonts w:ascii="Times New Roman" w:hAnsi="Times New Roman" w:cs="Times New Roman"/>
-          <w:sz w:val="28"/>
-          <w:szCs w:val="28"/>
-        </w:rPr>
-        <w:t>. После перехода по ссылке выполнение программы было остановлено в момент вызова данной функции, что позволило исследовать стек вызовов и передаваемые параметры.</w:t>
-      </w:r>
+        <w:jc w:val="center"/>
+        <w:rPr>
+          <w:rFonts w:ascii="Times New Roman" w:hAnsi="Times New Roman" w:cs="Times New Roman"/>
+          <w:sz w:val="28"/>
+          <w:szCs w:val="28"/>
+        </w:rPr>
+      </w:pPr>
       <w:r>
         <w:rPr>
           <w:rFonts w:ascii="Times New Roman" w:hAnsi="Times New Roman" w:cs="Times New Roman"/>
           <w:noProof/>
           <w:sz w:val="28"/>
           <w:szCs w:val="28"/>
-          <w:lang w:val="en-US"/>
         </w:rPr>
         <w:drawing>
-          <wp:inline distT="0" distB="0" distL="0" distR="0" wp14:anchorId="2A8CE9A5" wp14:editId="5147E5C6">
-            <wp:extent cx="6122670" cy="3525520"/>
-            <wp:effectExtent l="0" t="0" r="0" b="0"/>
-            <wp:docPr id="31" name="Рисунок 31"/>
+          <wp:inline distT="0" distB="0" distL="0" distR="0" wp14:anchorId="7F885BDB" wp14:editId="38EF881D">
+            <wp:extent cx="6122670" cy="430530"/>
+            <wp:effectExtent l="0" t="0" r="0" b="7620"/>
+            <wp:docPr id="32" name="Рисунок 32"/>
             <wp:cNvGraphicFramePr>
               <a:graphicFrameLocks xmlns:a="http://schemas.openxmlformats.org/drawingml/2006/main" noChangeAspect="1"/>
             </wp:cNvGraphicFramePr>
@@ -7823,166 +7919,6 @@
                   <pic:spPr>
                     <a:xfrm>
                       <a:off x="0" y="0"/>
-                      <a:ext cx="6122670" cy="3525520"/>
-                    </a:xfrm>
-                    <a:prstGeom prst="rect">
-                      <a:avLst/>
-                    </a:prstGeom>
-                  </pic:spPr>
-                </pic:pic>
-              </a:graphicData>
-            </a:graphic>
-          </wp:inline>
-        </w:drawing>
-      </w:r>
-    </w:p>
-    <w:p>
-      <w:pPr>
-        <w:pStyle w:val="af"/>
-        <w:spacing w:line="360" w:lineRule="auto"/>
-        <w:jc w:val="center"/>
-        <w:rPr>
-          <w:rFonts w:ascii="Times New Roman" w:hAnsi="Times New Roman" w:cs="Times New Roman"/>
-          <w:sz w:val="28"/>
-          <w:szCs w:val="28"/>
-        </w:rPr>
-      </w:pPr>
-      <w:r>
-        <w:rPr>
-          <w:rFonts w:ascii="Times New Roman" w:hAnsi="Times New Roman" w:cs="Times New Roman"/>
-          <w:sz w:val="28"/>
-          <w:szCs w:val="28"/>
-        </w:rPr>
-        <w:t xml:space="preserve">Рисунок </w:t>
-      </w:r>
-      <w:r>
-        <w:rPr>
-          <w:rFonts w:ascii="Times New Roman" w:hAnsi="Times New Roman" w:cs="Times New Roman"/>
-          <w:sz w:val="28"/>
-          <w:szCs w:val="28"/>
-        </w:rPr>
-        <w:t>14</w:t>
-      </w:r>
-      <w:r>
-        <w:rPr>
-          <w:rFonts w:ascii="Times New Roman" w:hAnsi="Times New Roman" w:cs="Times New Roman"/>
-          <w:sz w:val="28"/>
-          <w:szCs w:val="28"/>
-        </w:rPr>
-        <w:t>. Стек вызовов</w:t>
-      </w:r>
-    </w:p>
-    <w:p>
-      <w:pPr>
-        <w:pStyle w:val="af"/>
-        <w:spacing w:line="360" w:lineRule="auto"/>
-        <w:ind w:firstLine="851"/>
-        <w:jc w:val="both"/>
-        <w:rPr>
-          <w:rFonts w:ascii="Times New Roman" w:hAnsi="Times New Roman" w:cs="Times New Roman"/>
-          <w:sz w:val="28"/>
-          <w:szCs w:val="28"/>
-        </w:rPr>
-      </w:pPr>
-      <w:r>
-        <w:rPr>
-          <w:rFonts w:ascii="Times New Roman" w:hAnsi="Times New Roman" w:cs="Times New Roman"/>
-          <w:sz w:val="28"/>
-          <w:szCs w:val="28"/>
-        </w:rPr>
-        <w:t xml:space="preserve">Согласно документации Microsoft, вторым параметром функции </w:t>
-      </w:r>
-      <w:proofErr w:type="spellStart"/>
-      <w:r>
-        <w:rPr>
-          <w:rFonts w:ascii="Times New Roman" w:hAnsi="Times New Roman" w:cs="Times New Roman"/>
-          <w:sz w:val="28"/>
-          <w:szCs w:val="28"/>
-        </w:rPr>
-        <w:t>MkParseDisplayName</w:t>
-      </w:r>
-      <w:proofErr w:type="spellEnd"/>
-      <w:r>
-        <w:rPr>
-          <w:rFonts w:ascii="Times New Roman" w:hAnsi="Times New Roman" w:cs="Times New Roman"/>
-          <w:sz w:val="28"/>
-          <w:szCs w:val="28"/>
-        </w:rPr>
-        <w:t xml:space="preserve"> является </w:t>
-      </w:r>
-      <w:proofErr w:type="spellStart"/>
-      <w:r>
-        <w:rPr>
-          <w:rFonts w:ascii="Times New Roman" w:hAnsi="Times New Roman" w:cs="Times New Roman"/>
-          <w:sz w:val="28"/>
-          <w:szCs w:val="28"/>
-        </w:rPr>
-        <w:t>szUserName</w:t>
-      </w:r>
-      <w:proofErr w:type="spellEnd"/>
-      <w:r>
-        <w:rPr>
-          <w:rFonts w:ascii="Times New Roman" w:hAnsi="Times New Roman" w:cs="Times New Roman"/>
-          <w:sz w:val="28"/>
-          <w:szCs w:val="28"/>
-        </w:rPr>
-        <w:t xml:space="preserve"> — строковое представление объекта, подлежащего разрешению в COM Moniker. Анализ содержимого параметра показал, что в функцию передается путь к удаленному ресурсу без префикса file:///, что подтверждает передачу строки в механизм обработки Moniker.</w:t>
-      </w:r>
-    </w:p>
-    <w:p>
-      <w:pPr>
-        <w:pStyle w:val="af"/>
-        <w:spacing w:line="360" w:lineRule="auto"/>
-        <w:jc w:val="both"/>
-        <w:rPr>
-          <w:rFonts w:ascii="Times New Roman" w:hAnsi="Times New Roman" w:cs="Times New Roman"/>
-          <w:sz w:val="28"/>
-          <w:szCs w:val="28"/>
-        </w:rPr>
-      </w:pPr>
-    </w:p>
-    <w:p>
-      <w:pPr>
-        <w:pStyle w:val="af"/>
-        <w:spacing w:line="360" w:lineRule="auto"/>
-        <w:jc w:val="center"/>
-        <w:rPr>
-          <w:rFonts w:ascii="Times New Roman" w:hAnsi="Times New Roman" w:cs="Times New Roman"/>
-          <w:sz w:val="28"/>
-          <w:szCs w:val="28"/>
-        </w:rPr>
-      </w:pPr>
-      <w:r>
-        <w:rPr>
-          <w:rFonts w:ascii="Times New Roman" w:hAnsi="Times New Roman" w:cs="Times New Roman"/>
-          <w:noProof/>
-          <w:sz w:val="28"/>
-          <w:szCs w:val="28"/>
-        </w:rPr>
-        <w:drawing>
-          <wp:inline distT="0" distB="0" distL="0" distR="0" wp14:anchorId="7F885BDB" wp14:editId="38EF881D">
-            <wp:extent cx="6122670" cy="430530"/>
-            <wp:effectExtent l="0" t="0" r="0" b="7620"/>
-            <wp:docPr id="32" name="Рисунок 32"/>
-            <wp:cNvGraphicFramePr>
-              <a:graphicFrameLocks xmlns:a="http://schemas.openxmlformats.org/drawingml/2006/main" noChangeAspect="1"/>
-            </wp:cNvGraphicFramePr>
-            <a:graphic xmlns:a="http://schemas.openxmlformats.org/drawingml/2006/main">
-              <a:graphicData uri="http://schemas.openxmlformats.org/drawingml/2006/picture">
-                <pic:pic xmlns:pic="http://schemas.openxmlformats.org/drawingml/2006/picture">
-                  <pic:nvPicPr>
-                    <pic:cNvPr id="1" name=""/>
-                    <pic:cNvPicPr/>
-                  </pic:nvPicPr>
-                  <pic:blipFill>
-                    <a:blip r:embed="rId31"/>
-                    <a:stretch>
-                      <a:fillRect/>
-                    </a:stretch>
-                  </pic:blipFill>
-                  <pic:spPr>
-                    <a:xfrm>
-                      <a:off x="0" y="0"/>
                       <a:ext cx="6122670" cy="430530"/>
                     </a:xfrm>
                     <a:prstGeom prst="rect">
@@ -8506,7 +8442,7 @@
         </w:rPr>
         <w:t xml:space="preserve">] – </w:t>
       </w:r>
-      <w:hyperlink r:id="rId32" w:history="1">
+      <w:hyperlink r:id="rId31" w:history="1">
         <w:r>
           <w:rPr>
             <w:rStyle w:val="af0"/>
@@ -8593,7 +8529,7 @@
         </w:rPr>
         <w:t>–</w:t>
       </w:r>
-      <w:hyperlink r:id="rId33" w:history="1">
+      <w:hyperlink r:id="rId32" w:history="1">
         <w:r>
           <w:rPr>
             <w:rStyle w:val="af0"/>
@@ -8754,7 +8690,7 @@
         </w:rPr>
         <w:t xml:space="preserve"> </w:t>
       </w:r>
-      <w:hyperlink r:id="rId34" w:history="1">
+      <w:hyperlink r:id="rId33" w:history="1">
         <w:r>
           <w:rPr>
             <w:rStyle w:val="af0"/>
@@ -8845,7 +8781,7 @@
         </w:rPr>
         <w:t xml:space="preserve">] – </w:t>
       </w:r>
-      <w:hyperlink r:id="rId35" w:history="1">
+      <w:hyperlink r:id="rId34" w:history="1">
         <w:r>
           <w:rPr>
             <w:rStyle w:val="af0"/>
@@ -12587,7 +12523,7 @@
       </w:pPr>
     </w:p>
     <w:sectPr>
-      <w:headerReference w:type="default" r:id="rId36"/>
+      <w:headerReference w:type="default" r:id="rId35"/>
       <w:pgSz w:w="11910" w:h="16850"/>
       <w:pgMar w:top="1134" w:right="1134" w:bottom="1134" w:left="1134" w:header="726" w:footer="0" w:gutter="0"/>
       <w:cols w:space="720"/>

</xml_diff>